<commit_message>
feat(kak): add supplied cover and optional sequence
</commit_message>
<xml_diff>
--- a/src/templates/template-kak.docx
+++ b/src/templates/template-kak.docx
@@ -2,6 +2,796 @@
 <file path=word/document.xml><?xml version="1.0" encoding="utf-8"?>
 <w:document xmlns:wpc="http://schemas.microsoft.com/office/word/2010/wordprocessingCanvas" xmlns:cx="http://schemas.microsoft.com/office/drawing/2014/chartex" xmlns:cx1="http://schemas.microsoft.com/office/drawing/2015/9/8/chartex" xmlns:cx2="http://schemas.microsoft.com/office/drawing/2015/10/21/chartex" xmlns:cx3="http://schemas.microsoft.com/office/drawing/2016/5/9/chartex" xmlns:cx4="http://schemas.microsoft.com/office/drawing/2016/5/10/chartex" xmlns:cx5="http://schemas.microsoft.com/office/drawing/2016/5/11/chartex" xmlns:cx6="http://schemas.microsoft.com/office/drawing/2016/5/12/chartex" xmlns:cx7="http://schemas.microsoft.com/office/drawing/2016/5/13/chartex" xmlns:cx8="http://schemas.microsoft.com/office/drawing/2016/5/14/chartex" xmlns:mc="http://schemas.openxmlformats.org/markup-compatibility/2006" xmlns:aink="http://schemas.microsoft.com/office/drawing/2016/ink" xmlns:am3d="http://schemas.microsoft.com/office/drawing/2017/model3d" xmlns:o="urn:schemas-microsoft-com:office:office" xmlns:oel="http://schemas.microsoft.com/office/2019/extlst" xmlns:r="http://schemas.openxmlformats.org/officeDocument/2006/relationships" xmlns:m="http://schemas.openxmlformats.org/officeDocument/2006/math" xmlns:v="urn:schemas-microsoft-com:vml" xmlns:wp14="http://schemas.microsoft.com/office/word/2010/wordprocessingDrawing" xmlns:wp="http://schemas.openxmlformats.org/drawingml/2006/wordprocessingDrawing" xmlns:w10="urn:schemas-microsoft-com:office:word" xmlns:w="http://schemas.openxmlformats.org/wordprocessingml/2006/main" xmlns:w14="http://schemas.microsoft.com/office/word/2010/wordml" xmlns:w15="http://schemas.microsoft.com/office/word/2012/wordml" xmlns:w16cex="http://schemas.microsoft.com/office/word/2018/wordml/cex" xmlns:w16cid="http://schemas.microsoft.com/office/word/2016/wordml/cid" xmlns:w16="http://schemas.microsoft.com/office/word/2018/wordml" xmlns:w16du="http://schemas.microsoft.com/office/word/2023/wordml/word16du" xmlns:w16sdtdh="http://schemas.microsoft.com/office/word/2020/wordml/sdtdatahash" xmlns:w16sdtfl="http://schemas.microsoft.com/office/word/2024/wordml/sdtformatlock" xmlns:w16se="http://schemas.microsoft.com/office/word/2015/wordml/symex" xmlns:wpg="http://schemas.microsoft.com/office/word/2010/wordprocessingGroup" xmlns:wpi="http://schemas.microsoft.com/office/word/2010/wordprocessingInk" xmlns:wne="http://schemas.microsoft.com/office/word/2006/wordml" xmlns:wps="http://schemas.microsoft.com/office/word/2010/wordprocessingShape" mc:Ignorable="w14 w15 w16se w16cid w16 w16cex w16sdtdh w16sdtfl w16du wp14">
   <w:body>
+    <w:p xmlns:w="http://schemas.openxmlformats.org/wordprocessingml/2006/main" xmlns:w14="http://schemas.microsoft.com/office/word/2010/wordml" xmlns:wpc="http://schemas.microsoft.com/office/word/2010/wordprocessingCanvas" xmlns:cx="http://schemas.microsoft.com/office/drawing/2014/chartex" xmlns:cx1="http://schemas.microsoft.com/office/drawing/2015/9/8/chartex" xmlns:cx2="http://schemas.microsoft.com/office/drawing/2015/10/21/chartex" xmlns:cx3="http://schemas.microsoft.com/office/drawing/2016/5/9/chartex" xmlns:cx4="http://schemas.microsoft.com/office/drawing/2016/5/10/chartex" xmlns:cx5="http://schemas.microsoft.com/office/drawing/2016/5/11/chartex" xmlns:cx6="http://schemas.microsoft.com/office/drawing/2016/5/12/chartex" xmlns:cx7="http://schemas.microsoft.com/office/drawing/2016/5/13/chartex" xmlns:cx8="http://schemas.microsoft.com/office/drawing/2016/5/14/chartex" xmlns:mc="http://schemas.openxmlformats.org/markup-compatibility/2006" xmlns:aink="http://schemas.microsoft.com/office/drawing/2016/ink" xmlns:am3d="http://schemas.microsoft.com/office/drawing/2017/model3d" xmlns:o="urn:schemas-microsoft-com:office:office" xmlns:oel="http://schemas.microsoft.com/office/2019/extlst" xmlns:r="http://schemas.openxmlformats.org/officeDocument/2006/relationships" xmlns:m="http://schemas.openxmlformats.org/officeDocument/2006/math" xmlns:v="urn:schemas-microsoft-com:vml" xmlns:wp14="http://schemas.microsoft.com/office/word/2010/wordprocessingDrawing" xmlns:wp="http://schemas.openxmlformats.org/drawingml/2006/wordprocessingDrawing" xmlns:w10="urn:schemas-microsoft-com:office:word" xmlns:w15="http://schemas.microsoft.com/office/word/2012/wordml" xmlns:w16cex="http://schemas.microsoft.com/office/word/2018/wordml/cex" xmlns:w16cid="http://schemas.microsoft.com/office/word/2016/wordml/cid" xmlns:w16="http://schemas.microsoft.com/office/word/2018/wordml" xmlns:w16du="http://schemas.microsoft.com/office/word/2023/wordml/word16du" xmlns:w16sdtdh="http://schemas.microsoft.com/office/word/2020/wordml/sdtdatahash" xmlns:w16sdtfl="http://schemas.microsoft.com/office/word/2024/wordml/sdtformatlock" xmlns:w16se="http://schemas.microsoft.com/office/word/2015/wordml/symex" xmlns:wpg="http://schemas.microsoft.com/office/word/2010/wordprocessingGroup" xmlns:wpi="http://schemas.microsoft.com/office/word/2010/wordprocessingInk" xmlns:wne="http://schemas.microsoft.com/office/word/2006/wordml" xmlns:wps="http://schemas.microsoft.com/office/word/2010/wordprocessingShape">
+      <w:pPr>
+        <w:pStyle w:val="KakCoverNormal"/>
+      </w:pPr>
+    </w:p>
+    <w:p xmlns:w="http://schemas.openxmlformats.org/wordprocessingml/2006/main" xmlns:w14="http://schemas.microsoft.com/office/word/2010/wordml" xmlns:wpc="http://schemas.microsoft.com/office/word/2010/wordprocessingCanvas" xmlns:cx="http://schemas.microsoft.com/office/drawing/2014/chartex" xmlns:cx1="http://schemas.microsoft.com/office/drawing/2015/9/8/chartex" xmlns:cx2="http://schemas.microsoft.com/office/drawing/2015/10/21/chartex" xmlns:cx3="http://schemas.microsoft.com/office/drawing/2016/5/9/chartex" xmlns:cx4="http://schemas.microsoft.com/office/drawing/2016/5/10/chartex" xmlns:cx5="http://schemas.microsoft.com/office/drawing/2016/5/11/chartex" xmlns:cx6="http://schemas.microsoft.com/office/drawing/2016/5/12/chartex" xmlns:cx7="http://schemas.microsoft.com/office/drawing/2016/5/13/chartex" xmlns:cx8="http://schemas.microsoft.com/office/drawing/2016/5/14/chartex" xmlns:mc="http://schemas.openxmlformats.org/markup-compatibility/2006" xmlns:aink="http://schemas.microsoft.com/office/drawing/2016/ink" xmlns:am3d="http://schemas.microsoft.com/office/drawing/2017/model3d" xmlns:o="urn:schemas-microsoft-com:office:office" xmlns:oel="http://schemas.microsoft.com/office/2019/extlst" xmlns:r="http://schemas.openxmlformats.org/officeDocument/2006/relationships" xmlns:m="http://schemas.openxmlformats.org/officeDocument/2006/math" xmlns:v="urn:schemas-microsoft-com:vml" xmlns:wp14="http://schemas.microsoft.com/office/word/2010/wordprocessingDrawing" xmlns:wp="http://schemas.openxmlformats.org/drawingml/2006/wordprocessingDrawing" xmlns:w10="urn:schemas-microsoft-com:office:word" xmlns:w15="http://schemas.microsoft.com/office/word/2012/wordml" xmlns:w16cex="http://schemas.microsoft.com/office/word/2018/wordml/cex" xmlns:w16cid="http://schemas.microsoft.com/office/word/2016/wordml/cid" xmlns:w16="http://schemas.microsoft.com/office/word/2018/wordml" xmlns:w16du="http://schemas.microsoft.com/office/word/2023/wordml/word16du" xmlns:w16sdtdh="http://schemas.microsoft.com/office/word/2020/wordml/sdtdatahash" xmlns:w16sdtfl="http://schemas.microsoft.com/office/word/2024/wordml/sdtformatlock" xmlns:w16se="http://schemas.microsoft.com/office/word/2015/wordml/symex" xmlns:wpg="http://schemas.microsoft.com/office/word/2010/wordprocessingGroup" xmlns:wpi="http://schemas.microsoft.com/office/word/2010/wordprocessingInk" xmlns:wne="http://schemas.microsoft.com/office/word/2006/wordml" xmlns:wps="http://schemas.microsoft.com/office/word/2010/wordprocessingShape">
+      <w:pPr>
+        <w:pStyle w:val="KakCoverNormal"/>
+      </w:pPr>
+    </w:p>
+    <w:p xmlns:w="http://schemas.openxmlformats.org/wordprocessingml/2006/main" xmlns:w14="http://schemas.microsoft.com/office/word/2010/wordml" xmlns:wpc="http://schemas.microsoft.com/office/word/2010/wordprocessingCanvas" xmlns:cx="http://schemas.microsoft.com/office/drawing/2014/chartex" xmlns:cx1="http://schemas.microsoft.com/office/drawing/2015/9/8/chartex" xmlns:cx2="http://schemas.microsoft.com/office/drawing/2015/10/21/chartex" xmlns:cx3="http://schemas.microsoft.com/office/drawing/2016/5/9/chartex" xmlns:cx4="http://schemas.microsoft.com/office/drawing/2016/5/10/chartex" xmlns:cx5="http://schemas.microsoft.com/office/drawing/2016/5/11/chartex" xmlns:cx6="http://schemas.microsoft.com/office/drawing/2016/5/12/chartex" xmlns:cx7="http://schemas.microsoft.com/office/drawing/2016/5/13/chartex" xmlns:cx8="http://schemas.microsoft.com/office/drawing/2016/5/14/chartex" xmlns:mc="http://schemas.openxmlformats.org/markup-compatibility/2006" xmlns:aink="http://schemas.microsoft.com/office/drawing/2016/ink" xmlns:am3d="http://schemas.microsoft.com/office/drawing/2017/model3d" xmlns:o="urn:schemas-microsoft-com:office:office" xmlns:oel="http://schemas.microsoft.com/office/2019/extlst" xmlns:r="http://schemas.openxmlformats.org/officeDocument/2006/relationships" xmlns:m="http://schemas.openxmlformats.org/officeDocument/2006/math" xmlns:v="urn:schemas-microsoft-com:vml" xmlns:wp14="http://schemas.microsoft.com/office/word/2010/wordprocessingDrawing" xmlns:wp="http://schemas.openxmlformats.org/drawingml/2006/wordprocessingDrawing" xmlns:w10="urn:schemas-microsoft-com:office:word" xmlns:w15="http://schemas.microsoft.com/office/word/2012/wordml" xmlns:w16cex="http://schemas.microsoft.com/office/word/2018/wordml/cex" xmlns:w16cid="http://schemas.microsoft.com/office/word/2016/wordml/cid" xmlns:w16="http://schemas.microsoft.com/office/word/2018/wordml" xmlns:w16du="http://schemas.microsoft.com/office/word/2023/wordml/word16du" xmlns:w16sdtdh="http://schemas.microsoft.com/office/word/2020/wordml/sdtdatahash" xmlns:w16sdtfl="http://schemas.microsoft.com/office/word/2024/wordml/sdtformatlock" xmlns:w16se="http://schemas.microsoft.com/office/word/2015/wordml/symex" xmlns:wpg="http://schemas.microsoft.com/office/word/2010/wordprocessingGroup" xmlns:wpi="http://schemas.microsoft.com/office/word/2010/wordprocessingInk" xmlns:wne="http://schemas.microsoft.com/office/word/2006/wordml" xmlns:wps="http://schemas.microsoft.com/office/word/2010/wordprocessingShape">
+      <w:pPr>
+        <w:pStyle w:val="KakCoverNormal"/>
+      </w:pPr>
+    </w:p>
+    <w:p xmlns:w="http://schemas.openxmlformats.org/wordprocessingml/2006/main" xmlns:w14="http://schemas.microsoft.com/office/word/2010/wordml" xmlns:wpc="http://schemas.microsoft.com/office/word/2010/wordprocessingCanvas" xmlns:cx="http://schemas.microsoft.com/office/drawing/2014/chartex" xmlns:cx1="http://schemas.microsoft.com/office/drawing/2015/9/8/chartex" xmlns:cx2="http://schemas.microsoft.com/office/drawing/2015/10/21/chartex" xmlns:cx3="http://schemas.microsoft.com/office/drawing/2016/5/9/chartex" xmlns:cx4="http://schemas.microsoft.com/office/drawing/2016/5/10/chartex" xmlns:cx5="http://schemas.microsoft.com/office/drawing/2016/5/11/chartex" xmlns:cx6="http://schemas.microsoft.com/office/drawing/2016/5/12/chartex" xmlns:cx7="http://schemas.microsoft.com/office/drawing/2016/5/13/chartex" xmlns:cx8="http://schemas.microsoft.com/office/drawing/2016/5/14/chartex" xmlns:mc="http://schemas.openxmlformats.org/markup-compatibility/2006" xmlns:aink="http://schemas.microsoft.com/office/drawing/2016/ink" xmlns:am3d="http://schemas.microsoft.com/office/drawing/2017/model3d" xmlns:o="urn:schemas-microsoft-com:office:office" xmlns:oel="http://schemas.microsoft.com/office/2019/extlst" xmlns:r="http://schemas.openxmlformats.org/officeDocument/2006/relationships" xmlns:m="http://schemas.openxmlformats.org/officeDocument/2006/math" xmlns:v="urn:schemas-microsoft-com:vml" xmlns:wp14="http://schemas.microsoft.com/office/word/2010/wordprocessingDrawing" xmlns:wp="http://schemas.openxmlformats.org/drawingml/2006/wordprocessingDrawing" xmlns:w10="urn:schemas-microsoft-com:office:word" xmlns:w15="http://schemas.microsoft.com/office/word/2012/wordml" xmlns:w16cex="http://schemas.microsoft.com/office/word/2018/wordml/cex" xmlns:w16cid="http://schemas.microsoft.com/office/word/2016/wordml/cid" xmlns:w16="http://schemas.microsoft.com/office/word/2018/wordml" xmlns:w16du="http://schemas.microsoft.com/office/word/2023/wordml/word16du" xmlns:w16sdtdh="http://schemas.microsoft.com/office/word/2020/wordml/sdtdatahash" xmlns:w16sdtfl="http://schemas.microsoft.com/office/word/2024/wordml/sdtformatlock" xmlns:w16se="http://schemas.microsoft.com/office/word/2015/wordml/symex" xmlns:wpg="http://schemas.microsoft.com/office/word/2010/wordprocessingGroup" xmlns:wpi="http://schemas.microsoft.com/office/word/2010/wordprocessingInk" xmlns:wne="http://schemas.microsoft.com/office/word/2006/wordml" xmlns:wps="http://schemas.microsoft.com/office/word/2010/wordprocessingShape">
+      <w:pPr>
+        <w:pStyle w:val="KakCoverNormal"/>
+      </w:pPr>
+    </w:p>
+    <w:p xmlns:w="http://schemas.openxmlformats.org/wordprocessingml/2006/main" xmlns:w14="http://schemas.microsoft.com/office/word/2010/wordml" xmlns:wpc="http://schemas.microsoft.com/office/word/2010/wordprocessingCanvas" xmlns:cx="http://schemas.microsoft.com/office/drawing/2014/chartex" xmlns:cx1="http://schemas.microsoft.com/office/drawing/2015/9/8/chartex" xmlns:cx2="http://schemas.microsoft.com/office/drawing/2015/10/21/chartex" xmlns:cx3="http://schemas.microsoft.com/office/drawing/2016/5/9/chartex" xmlns:cx4="http://schemas.microsoft.com/office/drawing/2016/5/10/chartex" xmlns:cx5="http://schemas.microsoft.com/office/drawing/2016/5/11/chartex" xmlns:cx6="http://schemas.microsoft.com/office/drawing/2016/5/12/chartex" xmlns:cx7="http://schemas.microsoft.com/office/drawing/2016/5/13/chartex" xmlns:cx8="http://schemas.microsoft.com/office/drawing/2016/5/14/chartex" xmlns:mc="http://schemas.openxmlformats.org/markup-compatibility/2006" xmlns:aink="http://schemas.microsoft.com/office/drawing/2016/ink" xmlns:am3d="http://schemas.microsoft.com/office/drawing/2017/model3d" xmlns:o="urn:schemas-microsoft-com:office:office" xmlns:oel="http://schemas.microsoft.com/office/2019/extlst" xmlns:r="http://schemas.openxmlformats.org/officeDocument/2006/relationships" xmlns:m="http://schemas.openxmlformats.org/officeDocument/2006/math" xmlns:v="urn:schemas-microsoft-com:vml" xmlns:wp14="http://schemas.microsoft.com/office/word/2010/wordprocessingDrawing" xmlns:wp="http://schemas.openxmlformats.org/drawingml/2006/wordprocessingDrawing" xmlns:w10="urn:schemas-microsoft-com:office:word" xmlns:w15="http://schemas.microsoft.com/office/word/2012/wordml" xmlns:w16cex="http://schemas.microsoft.com/office/word/2018/wordml/cex" xmlns:w16cid="http://schemas.microsoft.com/office/word/2016/wordml/cid" xmlns:w16="http://schemas.microsoft.com/office/word/2018/wordml" xmlns:w16du="http://schemas.microsoft.com/office/word/2023/wordml/word16du" xmlns:w16sdtdh="http://schemas.microsoft.com/office/word/2020/wordml/sdtdatahash" xmlns:w16sdtfl="http://schemas.microsoft.com/office/word/2024/wordml/sdtformatlock" xmlns:w16se="http://schemas.microsoft.com/office/word/2015/wordml/symex" xmlns:wpg="http://schemas.microsoft.com/office/word/2010/wordprocessingGroup" xmlns:wpi="http://schemas.microsoft.com/office/word/2010/wordprocessingInk" xmlns:wne="http://schemas.microsoft.com/office/word/2006/wordml" xmlns:wps="http://schemas.microsoft.com/office/word/2010/wordprocessingShape">
+      <w:pPr>
+        <w:pStyle w:val="KakCoverNormal"/>
+      </w:pPr>
+    </w:p>
+    <w:p xmlns:w="http://schemas.openxmlformats.org/wordprocessingml/2006/main" xmlns:w14="http://schemas.microsoft.com/office/word/2010/wordml" xmlns:wpc="http://schemas.microsoft.com/office/word/2010/wordprocessingCanvas" xmlns:cx="http://schemas.microsoft.com/office/drawing/2014/chartex" xmlns:cx1="http://schemas.microsoft.com/office/drawing/2015/9/8/chartex" xmlns:cx2="http://schemas.microsoft.com/office/drawing/2015/10/21/chartex" xmlns:cx3="http://schemas.microsoft.com/office/drawing/2016/5/9/chartex" xmlns:cx4="http://schemas.microsoft.com/office/drawing/2016/5/10/chartex" xmlns:cx5="http://schemas.microsoft.com/office/drawing/2016/5/11/chartex" xmlns:cx6="http://schemas.microsoft.com/office/drawing/2016/5/12/chartex" xmlns:cx7="http://schemas.microsoft.com/office/drawing/2016/5/13/chartex" xmlns:cx8="http://schemas.microsoft.com/office/drawing/2016/5/14/chartex" xmlns:mc="http://schemas.openxmlformats.org/markup-compatibility/2006" xmlns:aink="http://schemas.microsoft.com/office/drawing/2016/ink" xmlns:am3d="http://schemas.microsoft.com/office/drawing/2017/model3d" xmlns:o="urn:schemas-microsoft-com:office:office" xmlns:oel="http://schemas.microsoft.com/office/2019/extlst" xmlns:r="http://schemas.openxmlformats.org/officeDocument/2006/relationships" xmlns:m="http://schemas.openxmlformats.org/officeDocument/2006/math" xmlns:v="urn:schemas-microsoft-com:vml" xmlns:wp14="http://schemas.microsoft.com/office/word/2010/wordprocessingDrawing" xmlns:wp="http://schemas.openxmlformats.org/drawingml/2006/wordprocessingDrawing" xmlns:w10="urn:schemas-microsoft-com:office:word" xmlns:w15="http://schemas.microsoft.com/office/word/2012/wordml" xmlns:w16cex="http://schemas.microsoft.com/office/word/2018/wordml/cex" xmlns:w16cid="http://schemas.microsoft.com/office/word/2016/wordml/cid" xmlns:w16="http://schemas.microsoft.com/office/word/2018/wordml" xmlns:w16du="http://schemas.microsoft.com/office/word/2023/wordml/word16du" xmlns:w16sdtdh="http://schemas.microsoft.com/office/word/2020/wordml/sdtdatahash" xmlns:w16sdtfl="http://schemas.microsoft.com/office/word/2024/wordml/sdtformatlock" xmlns:w16se="http://schemas.microsoft.com/office/word/2015/wordml/symex" xmlns:wpg="http://schemas.microsoft.com/office/word/2010/wordprocessingGroup" xmlns:wpi="http://schemas.microsoft.com/office/word/2010/wordprocessingInk" xmlns:wne="http://schemas.microsoft.com/office/word/2006/wordml" xmlns:wps="http://schemas.microsoft.com/office/word/2010/wordprocessingShape">
+      <w:pPr>
+        <w:pStyle w:val="KakCoverNormal"/>
+      </w:pPr>
+    </w:p>
+    <w:p xmlns:w="http://schemas.openxmlformats.org/wordprocessingml/2006/main" xmlns:w14="http://schemas.microsoft.com/office/word/2010/wordml" xmlns:wpc="http://schemas.microsoft.com/office/word/2010/wordprocessingCanvas" xmlns:cx="http://schemas.microsoft.com/office/drawing/2014/chartex" xmlns:cx1="http://schemas.microsoft.com/office/drawing/2015/9/8/chartex" xmlns:cx2="http://schemas.microsoft.com/office/drawing/2015/10/21/chartex" xmlns:cx3="http://schemas.microsoft.com/office/drawing/2016/5/9/chartex" xmlns:cx4="http://schemas.microsoft.com/office/drawing/2016/5/10/chartex" xmlns:cx5="http://schemas.microsoft.com/office/drawing/2016/5/11/chartex" xmlns:cx6="http://schemas.microsoft.com/office/drawing/2016/5/12/chartex" xmlns:cx7="http://schemas.microsoft.com/office/drawing/2016/5/13/chartex" xmlns:cx8="http://schemas.microsoft.com/office/drawing/2016/5/14/chartex" xmlns:mc="http://schemas.openxmlformats.org/markup-compatibility/2006" xmlns:aink="http://schemas.microsoft.com/office/drawing/2016/ink" xmlns:am3d="http://schemas.microsoft.com/office/drawing/2017/model3d" xmlns:o="urn:schemas-microsoft-com:office:office" xmlns:oel="http://schemas.microsoft.com/office/2019/extlst" xmlns:r="http://schemas.openxmlformats.org/officeDocument/2006/relationships" xmlns:m="http://schemas.openxmlformats.org/officeDocument/2006/math" xmlns:v="urn:schemas-microsoft-com:vml" xmlns:wp14="http://schemas.microsoft.com/office/word/2010/wordprocessingDrawing" xmlns:wp="http://schemas.openxmlformats.org/drawingml/2006/wordprocessingDrawing" xmlns:w10="urn:schemas-microsoft-com:office:word" xmlns:w15="http://schemas.microsoft.com/office/word/2012/wordml" xmlns:w16cex="http://schemas.microsoft.com/office/word/2018/wordml/cex" xmlns:w16cid="http://schemas.microsoft.com/office/word/2016/wordml/cid" xmlns:w16="http://schemas.microsoft.com/office/word/2018/wordml" xmlns:w16du="http://schemas.microsoft.com/office/word/2023/wordml/word16du" xmlns:w16sdtdh="http://schemas.microsoft.com/office/word/2020/wordml/sdtdatahash" xmlns:w16sdtfl="http://schemas.microsoft.com/office/word/2024/wordml/sdtformatlock" xmlns:w16se="http://schemas.microsoft.com/office/word/2015/wordml/symex" xmlns:wpg="http://schemas.microsoft.com/office/word/2010/wordprocessingGroup" xmlns:wpi="http://schemas.microsoft.com/office/word/2010/wordprocessingInk" xmlns:wne="http://schemas.microsoft.com/office/word/2006/wordml" xmlns:wps="http://schemas.microsoft.com/office/word/2010/wordprocessingShape">
+      <w:pPr>
+        <w:pStyle w:val="KakCoverNormal"/>
+      </w:pPr>
+    </w:p>
+    <w:p xmlns:w="http://schemas.openxmlformats.org/wordprocessingml/2006/main" xmlns:w14="http://schemas.microsoft.com/office/word/2010/wordml" xmlns:wpc="http://schemas.microsoft.com/office/word/2010/wordprocessingCanvas" xmlns:cx="http://schemas.microsoft.com/office/drawing/2014/chartex" xmlns:cx1="http://schemas.microsoft.com/office/drawing/2015/9/8/chartex" xmlns:cx2="http://schemas.microsoft.com/office/drawing/2015/10/21/chartex" xmlns:cx3="http://schemas.microsoft.com/office/drawing/2016/5/9/chartex" xmlns:cx4="http://schemas.microsoft.com/office/drawing/2016/5/10/chartex" xmlns:cx5="http://schemas.microsoft.com/office/drawing/2016/5/11/chartex" xmlns:cx6="http://schemas.microsoft.com/office/drawing/2016/5/12/chartex" xmlns:cx7="http://schemas.microsoft.com/office/drawing/2016/5/13/chartex" xmlns:cx8="http://schemas.microsoft.com/office/drawing/2016/5/14/chartex" xmlns:mc="http://schemas.openxmlformats.org/markup-compatibility/2006" xmlns:aink="http://schemas.microsoft.com/office/drawing/2016/ink" xmlns:am3d="http://schemas.microsoft.com/office/drawing/2017/model3d" xmlns:o="urn:schemas-microsoft-com:office:office" xmlns:oel="http://schemas.microsoft.com/office/2019/extlst" xmlns:r="http://schemas.openxmlformats.org/officeDocument/2006/relationships" xmlns:m="http://schemas.openxmlformats.org/officeDocument/2006/math" xmlns:v="urn:schemas-microsoft-com:vml" xmlns:wp14="http://schemas.microsoft.com/office/word/2010/wordprocessingDrawing" xmlns:wp="http://schemas.openxmlformats.org/drawingml/2006/wordprocessingDrawing" xmlns:w10="urn:schemas-microsoft-com:office:word" xmlns:w15="http://schemas.microsoft.com/office/word/2012/wordml" xmlns:w16cex="http://schemas.microsoft.com/office/word/2018/wordml/cex" xmlns:w16cid="http://schemas.microsoft.com/office/word/2016/wordml/cid" xmlns:w16="http://schemas.microsoft.com/office/word/2018/wordml" xmlns:w16du="http://schemas.microsoft.com/office/word/2023/wordml/word16du" xmlns:w16sdtdh="http://schemas.microsoft.com/office/word/2020/wordml/sdtdatahash" xmlns:w16sdtfl="http://schemas.microsoft.com/office/word/2024/wordml/sdtformatlock" xmlns:w16se="http://schemas.microsoft.com/office/word/2015/wordml/symex" xmlns:wpg="http://schemas.microsoft.com/office/word/2010/wordprocessingGroup" xmlns:wpi="http://schemas.microsoft.com/office/word/2010/wordprocessingInk" xmlns:wne="http://schemas.microsoft.com/office/word/2006/wordml" xmlns:wps="http://schemas.microsoft.com/office/word/2010/wordprocessingShape">
+      <w:pPr>
+        <w:pStyle w:val="KakCoverNormal"/>
+      </w:pPr>
+    </w:p>
+    <w:p xmlns:w="http://schemas.openxmlformats.org/wordprocessingml/2006/main" xmlns:w14="http://schemas.microsoft.com/office/word/2010/wordml" xmlns:wpc="http://schemas.microsoft.com/office/word/2010/wordprocessingCanvas" xmlns:cx="http://schemas.microsoft.com/office/drawing/2014/chartex" xmlns:cx1="http://schemas.microsoft.com/office/drawing/2015/9/8/chartex" xmlns:cx2="http://schemas.microsoft.com/office/drawing/2015/10/21/chartex" xmlns:cx3="http://schemas.microsoft.com/office/drawing/2016/5/9/chartex" xmlns:cx4="http://schemas.microsoft.com/office/drawing/2016/5/10/chartex" xmlns:cx5="http://schemas.microsoft.com/office/drawing/2016/5/11/chartex" xmlns:cx6="http://schemas.microsoft.com/office/drawing/2016/5/12/chartex" xmlns:cx7="http://schemas.microsoft.com/office/drawing/2016/5/13/chartex" xmlns:cx8="http://schemas.microsoft.com/office/drawing/2016/5/14/chartex" xmlns:mc="http://schemas.openxmlformats.org/markup-compatibility/2006" xmlns:aink="http://schemas.microsoft.com/office/drawing/2016/ink" xmlns:am3d="http://schemas.microsoft.com/office/drawing/2017/model3d" xmlns:o="urn:schemas-microsoft-com:office:office" xmlns:oel="http://schemas.microsoft.com/office/2019/extlst" xmlns:r="http://schemas.openxmlformats.org/officeDocument/2006/relationships" xmlns:m="http://schemas.openxmlformats.org/officeDocument/2006/math" xmlns:v="urn:schemas-microsoft-com:vml" xmlns:wp14="http://schemas.microsoft.com/office/word/2010/wordprocessingDrawing" xmlns:wp="http://schemas.openxmlformats.org/drawingml/2006/wordprocessingDrawing" xmlns:w10="urn:schemas-microsoft-com:office:word" xmlns:w15="http://schemas.microsoft.com/office/word/2012/wordml" xmlns:w16cex="http://schemas.microsoft.com/office/word/2018/wordml/cex" xmlns:w16cid="http://schemas.microsoft.com/office/word/2016/wordml/cid" xmlns:w16="http://schemas.microsoft.com/office/word/2018/wordml" xmlns:w16du="http://schemas.microsoft.com/office/word/2023/wordml/word16du" xmlns:w16sdtdh="http://schemas.microsoft.com/office/word/2020/wordml/sdtdatahash" xmlns:w16sdtfl="http://schemas.microsoft.com/office/word/2024/wordml/sdtformatlock" xmlns:w16se="http://schemas.microsoft.com/office/word/2015/wordml/symex" xmlns:wpg="http://schemas.microsoft.com/office/word/2010/wordprocessingGroup" xmlns:wpi="http://schemas.microsoft.com/office/word/2010/wordprocessingInk" xmlns:wne="http://schemas.microsoft.com/office/word/2006/wordml" xmlns:wps="http://schemas.microsoft.com/office/word/2010/wordprocessingShape">
+      <w:pPr>
+        <w:pStyle w:val="KakCoverNormal"/>
+      </w:pPr>
+    </w:p>
+    <w:p xmlns:w="http://schemas.openxmlformats.org/wordprocessingml/2006/main" xmlns:w14="http://schemas.microsoft.com/office/word/2010/wordml" xmlns:wpc="http://schemas.microsoft.com/office/word/2010/wordprocessingCanvas" xmlns:cx="http://schemas.microsoft.com/office/drawing/2014/chartex" xmlns:cx1="http://schemas.microsoft.com/office/drawing/2015/9/8/chartex" xmlns:cx2="http://schemas.microsoft.com/office/drawing/2015/10/21/chartex" xmlns:cx3="http://schemas.microsoft.com/office/drawing/2016/5/9/chartex" xmlns:cx4="http://schemas.microsoft.com/office/drawing/2016/5/10/chartex" xmlns:cx5="http://schemas.microsoft.com/office/drawing/2016/5/11/chartex" xmlns:cx6="http://schemas.microsoft.com/office/drawing/2016/5/12/chartex" xmlns:cx7="http://schemas.microsoft.com/office/drawing/2016/5/13/chartex" xmlns:cx8="http://schemas.microsoft.com/office/drawing/2016/5/14/chartex" xmlns:mc="http://schemas.openxmlformats.org/markup-compatibility/2006" xmlns:aink="http://schemas.microsoft.com/office/drawing/2016/ink" xmlns:am3d="http://schemas.microsoft.com/office/drawing/2017/model3d" xmlns:o="urn:schemas-microsoft-com:office:office" xmlns:oel="http://schemas.microsoft.com/office/2019/extlst" xmlns:r="http://schemas.openxmlformats.org/officeDocument/2006/relationships" xmlns:m="http://schemas.openxmlformats.org/officeDocument/2006/math" xmlns:v="urn:schemas-microsoft-com:vml" xmlns:wp14="http://schemas.microsoft.com/office/word/2010/wordprocessingDrawing" xmlns:wp="http://schemas.openxmlformats.org/drawingml/2006/wordprocessingDrawing" xmlns:w10="urn:schemas-microsoft-com:office:word" xmlns:w15="http://schemas.microsoft.com/office/word/2012/wordml" xmlns:w16cex="http://schemas.microsoft.com/office/word/2018/wordml/cex" xmlns:w16cid="http://schemas.microsoft.com/office/word/2016/wordml/cid" xmlns:w16="http://schemas.microsoft.com/office/word/2018/wordml" xmlns:w16du="http://schemas.microsoft.com/office/word/2023/wordml/word16du" xmlns:w16sdtdh="http://schemas.microsoft.com/office/word/2020/wordml/sdtdatahash" xmlns:w16sdtfl="http://schemas.microsoft.com/office/word/2024/wordml/sdtformatlock" xmlns:w16se="http://schemas.microsoft.com/office/word/2015/wordml/symex" xmlns:wpg="http://schemas.microsoft.com/office/word/2010/wordprocessingGroup" xmlns:wpi="http://schemas.microsoft.com/office/word/2010/wordprocessingInk" xmlns:wne="http://schemas.microsoft.com/office/word/2006/wordml" xmlns:wps="http://schemas.microsoft.com/office/word/2010/wordprocessingShape">
+      <w:pPr>
+        <w:pStyle w:val="KakCoverNormal"/>
+      </w:pPr>
+    </w:p>
+    <w:p xmlns:w="http://schemas.openxmlformats.org/wordprocessingml/2006/main" xmlns:w14="http://schemas.microsoft.com/office/word/2010/wordml" xmlns:wpc="http://schemas.microsoft.com/office/word/2010/wordprocessingCanvas" xmlns:cx="http://schemas.microsoft.com/office/drawing/2014/chartex" xmlns:cx1="http://schemas.microsoft.com/office/drawing/2015/9/8/chartex" xmlns:cx2="http://schemas.microsoft.com/office/drawing/2015/10/21/chartex" xmlns:cx3="http://schemas.microsoft.com/office/drawing/2016/5/9/chartex" xmlns:cx4="http://schemas.microsoft.com/office/drawing/2016/5/10/chartex" xmlns:cx5="http://schemas.microsoft.com/office/drawing/2016/5/11/chartex" xmlns:cx6="http://schemas.microsoft.com/office/drawing/2016/5/12/chartex" xmlns:cx7="http://schemas.microsoft.com/office/drawing/2016/5/13/chartex" xmlns:cx8="http://schemas.microsoft.com/office/drawing/2016/5/14/chartex" xmlns:mc="http://schemas.openxmlformats.org/markup-compatibility/2006" xmlns:aink="http://schemas.microsoft.com/office/drawing/2016/ink" xmlns:am3d="http://schemas.microsoft.com/office/drawing/2017/model3d" xmlns:o="urn:schemas-microsoft-com:office:office" xmlns:oel="http://schemas.microsoft.com/office/2019/extlst" xmlns:r="http://schemas.openxmlformats.org/officeDocument/2006/relationships" xmlns:m="http://schemas.openxmlformats.org/officeDocument/2006/math" xmlns:v="urn:schemas-microsoft-com:vml" xmlns:wp14="http://schemas.microsoft.com/office/word/2010/wordprocessingDrawing" xmlns:wp="http://schemas.openxmlformats.org/drawingml/2006/wordprocessingDrawing" xmlns:w10="urn:schemas-microsoft-com:office:word" xmlns:w15="http://schemas.microsoft.com/office/word/2012/wordml" xmlns:w16cex="http://schemas.microsoft.com/office/word/2018/wordml/cex" xmlns:w16cid="http://schemas.microsoft.com/office/word/2016/wordml/cid" xmlns:w16="http://schemas.microsoft.com/office/word/2018/wordml" xmlns:w16du="http://schemas.microsoft.com/office/word/2023/wordml/word16du" xmlns:w16sdtdh="http://schemas.microsoft.com/office/word/2020/wordml/sdtdatahash" xmlns:w16sdtfl="http://schemas.microsoft.com/office/word/2024/wordml/sdtformatlock" xmlns:w16se="http://schemas.microsoft.com/office/word/2015/wordml/symex" xmlns:wpg="http://schemas.microsoft.com/office/word/2010/wordprocessingGroup" xmlns:wpi="http://schemas.microsoft.com/office/word/2010/wordprocessingInk" xmlns:wne="http://schemas.microsoft.com/office/word/2006/wordml" xmlns:wps="http://schemas.microsoft.com/office/word/2010/wordprocessingShape">
+      <w:pPr>
+        <w:pStyle w:val="KakCoverNormal"/>
+      </w:pPr>
+      <w:r>
+        <w:rPr>
+          <w:rFonts w:ascii="Tahoma" w:hAnsi="Tahoma" w:cs="Tahoma"/>
+          <w:b/>
+          <w:noProof/>
+        </w:rPr>
+        <w:drawing>
+          <wp:anchor distT="0" distB="0" distL="114300" distR="114300" simplePos="0" relativeHeight="251694080" behindDoc="0" locked="0" layoutInCell="1" allowOverlap="1" wp14:anchorId="4FE27F11" wp14:editId="3F318B43">
+            <wp:simplePos x="0" y="0"/>
+            <wp:positionH relativeFrom="column">
+              <wp:posOffset>2010508</wp:posOffset>
+            </wp:positionH>
+            <wp:positionV relativeFrom="paragraph">
+              <wp:posOffset>-264893</wp:posOffset>
+            </wp:positionV>
+            <wp:extent cx="2065020" cy="2323039"/>
+            <wp:effectExtent l="0" t="0" r="0" b="0"/>
+            <wp:wrapNone/>
+            <wp:docPr id="18" name="Picture 18"/>
+            <wp:cNvGraphicFramePr>
+              <a:graphicFrameLocks xmlns:a="http://schemas.openxmlformats.org/drawingml/2006/main" noChangeAspect="1"/>
+            </wp:cNvGraphicFramePr>
+            <a:graphic xmlns:a="http://schemas.openxmlformats.org/drawingml/2006/main">
+              <a:graphicData uri="http://schemas.openxmlformats.org/drawingml/2006/picture">
+                <pic:pic xmlns:pic="http://schemas.openxmlformats.org/drawingml/2006/picture">
+                  <pic:nvPicPr>
+                    <pic:cNvPr id="0" name="Picture 3"/>
+                    <pic:cNvPicPr>
+                      <a:picLocks noChangeAspect="1" noChangeArrowheads="1"/>
+                    </pic:cNvPicPr>
+                  </pic:nvPicPr>
+                  <pic:blipFill>
+                    <a:blip r:embed="rIdKakCoverLogo" cstate="print">
+                      <a:extLst>
+                        <a:ext uri="{28A0092B-C50C-407E-A947-70E740481C1C}">
+                          <a14:useLocalDpi xmlns:a14="http://schemas.microsoft.com/office/drawing/2010/main" val="0"/>
+                        </a:ext>
+                      </a:extLst>
+                    </a:blip>
+                    <a:srcRect/>
+                    <a:stretch>
+                      <a:fillRect/>
+                    </a:stretch>
+                  </pic:blipFill>
+                  <pic:spPr bwMode="auto">
+                    <a:xfrm>
+                      <a:off x="0" y="0"/>
+                      <a:ext cx="2065020" cy="2323039"/>
+                    </a:xfrm>
+                    <a:prstGeom prst="rect">
+                      <a:avLst/>
+                    </a:prstGeom>
+                    <a:noFill/>
+                  </pic:spPr>
+                </pic:pic>
+              </a:graphicData>
+            </a:graphic>
+            <wp14:sizeRelH relativeFrom="margin">
+              <wp14:pctWidth>0</wp14:pctWidth>
+            </wp14:sizeRelH>
+            <wp14:sizeRelV relativeFrom="margin">
+              <wp14:pctHeight>0</wp14:pctHeight>
+            </wp14:sizeRelV>
+          </wp:anchor>
+        </w:drawing>
+      </w:r>
+    </w:p>
+    <w:p xmlns:w="http://schemas.openxmlformats.org/wordprocessingml/2006/main" xmlns:w14="http://schemas.microsoft.com/office/word/2010/wordml" xmlns:wpc="http://schemas.microsoft.com/office/word/2010/wordprocessingCanvas" xmlns:cx="http://schemas.microsoft.com/office/drawing/2014/chartex" xmlns:cx1="http://schemas.microsoft.com/office/drawing/2015/9/8/chartex" xmlns:cx2="http://schemas.microsoft.com/office/drawing/2015/10/21/chartex" xmlns:cx3="http://schemas.microsoft.com/office/drawing/2016/5/9/chartex" xmlns:cx4="http://schemas.microsoft.com/office/drawing/2016/5/10/chartex" xmlns:cx5="http://schemas.microsoft.com/office/drawing/2016/5/11/chartex" xmlns:cx6="http://schemas.microsoft.com/office/drawing/2016/5/12/chartex" xmlns:cx7="http://schemas.microsoft.com/office/drawing/2016/5/13/chartex" xmlns:cx8="http://schemas.microsoft.com/office/drawing/2016/5/14/chartex" xmlns:mc="http://schemas.openxmlformats.org/markup-compatibility/2006" xmlns:aink="http://schemas.microsoft.com/office/drawing/2016/ink" xmlns:am3d="http://schemas.microsoft.com/office/drawing/2017/model3d" xmlns:o="urn:schemas-microsoft-com:office:office" xmlns:oel="http://schemas.microsoft.com/office/2019/extlst" xmlns:r="http://schemas.openxmlformats.org/officeDocument/2006/relationships" xmlns:m="http://schemas.openxmlformats.org/officeDocument/2006/math" xmlns:v="urn:schemas-microsoft-com:vml" xmlns:wp14="http://schemas.microsoft.com/office/word/2010/wordprocessingDrawing" xmlns:wp="http://schemas.openxmlformats.org/drawingml/2006/wordprocessingDrawing" xmlns:w10="urn:schemas-microsoft-com:office:word" xmlns:w15="http://schemas.microsoft.com/office/word/2012/wordml" xmlns:w16cex="http://schemas.microsoft.com/office/word/2018/wordml/cex" xmlns:w16cid="http://schemas.microsoft.com/office/word/2016/wordml/cid" xmlns:w16="http://schemas.microsoft.com/office/word/2018/wordml" xmlns:w16du="http://schemas.microsoft.com/office/word/2023/wordml/word16du" xmlns:w16sdtdh="http://schemas.microsoft.com/office/word/2020/wordml/sdtdatahash" xmlns:w16sdtfl="http://schemas.microsoft.com/office/word/2024/wordml/sdtformatlock" xmlns:w16se="http://schemas.microsoft.com/office/word/2015/wordml/symex" xmlns:wpg="http://schemas.microsoft.com/office/word/2010/wordprocessingGroup" xmlns:wpi="http://schemas.microsoft.com/office/word/2010/wordprocessingInk" xmlns:wne="http://schemas.microsoft.com/office/word/2006/wordml" xmlns:wps="http://schemas.microsoft.com/office/word/2010/wordprocessingShape">
+      <w:pPr>
+        <w:pStyle w:val="KakCoverNormal"/>
+      </w:pPr>
+    </w:p>
+    <w:p xmlns:w="http://schemas.openxmlformats.org/wordprocessingml/2006/main" xmlns:w14="http://schemas.microsoft.com/office/word/2010/wordml" xmlns:wpc="http://schemas.microsoft.com/office/word/2010/wordprocessingCanvas" xmlns:cx="http://schemas.microsoft.com/office/drawing/2014/chartex" xmlns:cx1="http://schemas.microsoft.com/office/drawing/2015/9/8/chartex" xmlns:cx2="http://schemas.microsoft.com/office/drawing/2015/10/21/chartex" xmlns:cx3="http://schemas.microsoft.com/office/drawing/2016/5/9/chartex" xmlns:cx4="http://schemas.microsoft.com/office/drawing/2016/5/10/chartex" xmlns:cx5="http://schemas.microsoft.com/office/drawing/2016/5/11/chartex" xmlns:cx6="http://schemas.microsoft.com/office/drawing/2016/5/12/chartex" xmlns:cx7="http://schemas.microsoft.com/office/drawing/2016/5/13/chartex" xmlns:cx8="http://schemas.microsoft.com/office/drawing/2016/5/14/chartex" xmlns:mc="http://schemas.openxmlformats.org/markup-compatibility/2006" xmlns:aink="http://schemas.microsoft.com/office/drawing/2016/ink" xmlns:am3d="http://schemas.microsoft.com/office/drawing/2017/model3d" xmlns:o="urn:schemas-microsoft-com:office:office" xmlns:oel="http://schemas.microsoft.com/office/2019/extlst" xmlns:r="http://schemas.openxmlformats.org/officeDocument/2006/relationships" xmlns:m="http://schemas.openxmlformats.org/officeDocument/2006/math" xmlns:v="urn:schemas-microsoft-com:vml" xmlns:wp14="http://schemas.microsoft.com/office/word/2010/wordprocessingDrawing" xmlns:wp="http://schemas.openxmlformats.org/drawingml/2006/wordprocessingDrawing" xmlns:w10="urn:schemas-microsoft-com:office:word" xmlns:w15="http://schemas.microsoft.com/office/word/2012/wordml" xmlns:w16cex="http://schemas.microsoft.com/office/word/2018/wordml/cex" xmlns:w16cid="http://schemas.microsoft.com/office/word/2016/wordml/cid" xmlns:w16="http://schemas.microsoft.com/office/word/2018/wordml" xmlns:w16du="http://schemas.microsoft.com/office/word/2023/wordml/word16du" xmlns:w16sdtdh="http://schemas.microsoft.com/office/word/2020/wordml/sdtdatahash" xmlns:w16sdtfl="http://schemas.microsoft.com/office/word/2024/wordml/sdtformatlock" xmlns:w16se="http://schemas.microsoft.com/office/word/2015/wordml/symex" xmlns:wpg="http://schemas.microsoft.com/office/word/2010/wordprocessingGroup" xmlns:wpi="http://schemas.microsoft.com/office/word/2010/wordprocessingInk" xmlns:wne="http://schemas.microsoft.com/office/word/2006/wordml" xmlns:wps="http://schemas.microsoft.com/office/word/2010/wordprocessingShape">
+      <w:pPr>
+        <w:pStyle w:val="KakCoverNormal"/>
+      </w:pPr>
+    </w:p>
+    <w:p xmlns:w="http://schemas.openxmlformats.org/wordprocessingml/2006/main" xmlns:w14="http://schemas.microsoft.com/office/word/2010/wordml" xmlns:wpc="http://schemas.microsoft.com/office/word/2010/wordprocessingCanvas" xmlns:cx="http://schemas.microsoft.com/office/drawing/2014/chartex" xmlns:cx1="http://schemas.microsoft.com/office/drawing/2015/9/8/chartex" xmlns:cx2="http://schemas.microsoft.com/office/drawing/2015/10/21/chartex" xmlns:cx3="http://schemas.microsoft.com/office/drawing/2016/5/9/chartex" xmlns:cx4="http://schemas.microsoft.com/office/drawing/2016/5/10/chartex" xmlns:cx5="http://schemas.microsoft.com/office/drawing/2016/5/11/chartex" xmlns:cx6="http://schemas.microsoft.com/office/drawing/2016/5/12/chartex" xmlns:cx7="http://schemas.microsoft.com/office/drawing/2016/5/13/chartex" xmlns:cx8="http://schemas.microsoft.com/office/drawing/2016/5/14/chartex" xmlns:mc="http://schemas.openxmlformats.org/markup-compatibility/2006" xmlns:aink="http://schemas.microsoft.com/office/drawing/2016/ink" xmlns:am3d="http://schemas.microsoft.com/office/drawing/2017/model3d" xmlns:o="urn:schemas-microsoft-com:office:office" xmlns:oel="http://schemas.microsoft.com/office/2019/extlst" xmlns:r="http://schemas.openxmlformats.org/officeDocument/2006/relationships" xmlns:m="http://schemas.openxmlformats.org/officeDocument/2006/math" xmlns:v="urn:schemas-microsoft-com:vml" xmlns:wp14="http://schemas.microsoft.com/office/word/2010/wordprocessingDrawing" xmlns:wp="http://schemas.openxmlformats.org/drawingml/2006/wordprocessingDrawing" xmlns:w10="urn:schemas-microsoft-com:office:word" xmlns:w15="http://schemas.microsoft.com/office/word/2012/wordml" xmlns:w16cex="http://schemas.microsoft.com/office/word/2018/wordml/cex" xmlns:w16cid="http://schemas.microsoft.com/office/word/2016/wordml/cid" xmlns:w16="http://schemas.microsoft.com/office/word/2018/wordml" xmlns:w16du="http://schemas.microsoft.com/office/word/2023/wordml/word16du" xmlns:w16sdtdh="http://schemas.microsoft.com/office/word/2020/wordml/sdtdatahash" xmlns:w16sdtfl="http://schemas.microsoft.com/office/word/2024/wordml/sdtformatlock" xmlns:w16se="http://schemas.microsoft.com/office/word/2015/wordml/symex" xmlns:wpg="http://schemas.microsoft.com/office/word/2010/wordprocessingGroup" xmlns:wpi="http://schemas.microsoft.com/office/word/2010/wordprocessingInk" xmlns:wne="http://schemas.microsoft.com/office/word/2006/wordml" xmlns:wps="http://schemas.microsoft.com/office/word/2010/wordprocessingShape">
+      <w:pPr>
+        <w:pStyle w:val="KakCoverNormal"/>
+      </w:pPr>
+    </w:p>
+    <w:p xmlns:w="http://schemas.openxmlformats.org/wordprocessingml/2006/main" xmlns:w14="http://schemas.microsoft.com/office/word/2010/wordml" xmlns:wpc="http://schemas.microsoft.com/office/word/2010/wordprocessingCanvas" xmlns:cx="http://schemas.microsoft.com/office/drawing/2014/chartex" xmlns:cx1="http://schemas.microsoft.com/office/drawing/2015/9/8/chartex" xmlns:cx2="http://schemas.microsoft.com/office/drawing/2015/10/21/chartex" xmlns:cx3="http://schemas.microsoft.com/office/drawing/2016/5/9/chartex" xmlns:cx4="http://schemas.microsoft.com/office/drawing/2016/5/10/chartex" xmlns:cx5="http://schemas.microsoft.com/office/drawing/2016/5/11/chartex" xmlns:cx6="http://schemas.microsoft.com/office/drawing/2016/5/12/chartex" xmlns:cx7="http://schemas.microsoft.com/office/drawing/2016/5/13/chartex" xmlns:cx8="http://schemas.microsoft.com/office/drawing/2016/5/14/chartex" xmlns:mc="http://schemas.openxmlformats.org/markup-compatibility/2006" xmlns:aink="http://schemas.microsoft.com/office/drawing/2016/ink" xmlns:am3d="http://schemas.microsoft.com/office/drawing/2017/model3d" xmlns:o="urn:schemas-microsoft-com:office:office" xmlns:oel="http://schemas.microsoft.com/office/2019/extlst" xmlns:r="http://schemas.openxmlformats.org/officeDocument/2006/relationships" xmlns:m="http://schemas.openxmlformats.org/officeDocument/2006/math" xmlns:v="urn:schemas-microsoft-com:vml" xmlns:wp14="http://schemas.microsoft.com/office/word/2010/wordprocessingDrawing" xmlns:wp="http://schemas.openxmlformats.org/drawingml/2006/wordprocessingDrawing" xmlns:w10="urn:schemas-microsoft-com:office:word" xmlns:w15="http://schemas.microsoft.com/office/word/2012/wordml" xmlns:w16cex="http://schemas.microsoft.com/office/word/2018/wordml/cex" xmlns:w16cid="http://schemas.microsoft.com/office/word/2016/wordml/cid" xmlns:w16="http://schemas.microsoft.com/office/word/2018/wordml" xmlns:w16du="http://schemas.microsoft.com/office/word/2023/wordml/word16du" xmlns:w16sdtdh="http://schemas.microsoft.com/office/word/2020/wordml/sdtdatahash" xmlns:w16sdtfl="http://schemas.microsoft.com/office/word/2024/wordml/sdtformatlock" xmlns:w16se="http://schemas.microsoft.com/office/word/2015/wordml/symex" xmlns:wpg="http://schemas.microsoft.com/office/word/2010/wordprocessingGroup" xmlns:wpi="http://schemas.microsoft.com/office/word/2010/wordprocessingInk" xmlns:wne="http://schemas.microsoft.com/office/word/2006/wordml" xmlns:wps="http://schemas.microsoft.com/office/word/2010/wordprocessingShape">
+      <w:pPr>
+        <w:pStyle w:val="KakCoverNormal"/>
+      </w:pPr>
+    </w:p>
+    <w:p xmlns:w="http://schemas.openxmlformats.org/wordprocessingml/2006/main" xmlns:w14="http://schemas.microsoft.com/office/word/2010/wordml" xmlns:wpc="http://schemas.microsoft.com/office/word/2010/wordprocessingCanvas" xmlns:cx="http://schemas.microsoft.com/office/drawing/2014/chartex" xmlns:cx1="http://schemas.microsoft.com/office/drawing/2015/9/8/chartex" xmlns:cx2="http://schemas.microsoft.com/office/drawing/2015/10/21/chartex" xmlns:cx3="http://schemas.microsoft.com/office/drawing/2016/5/9/chartex" xmlns:cx4="http://schemas.microsoft.com/office/drawing/2016/5/10/chartex" xmlns:cx5="http://schemas.microsoft.com/office/drawing/2016/5/11/chartex" xmlns:cx6="http://schemas.microsoft.com/office/drawing/2016/5/12/chartex" xmlns:cx7="http://schemas.microsoft.com/office/drawing/2016/5/13/chartex" xmlns:cx8="http://schemas.microsoft.com/office/drawing/2016/5/14/chartex" xmlns:mc="http://schemas.openxmlformats.org/markup-compatibility/2006" xmlns:aink="http://schemas.microsoft.com/office/drawing/2016/ink" xmlns:am3d="http://schemas.microsoft.com/office/drawing/2017/model3d" xmlns:o="urn:schemas-microsoft-com:office:office" xmlns:oel="http://schemas.microsoft.com/office/2019/extlst" xmlns:r="http://schemas.openxmlformats.org/officeDocument/2006/relationships" xmlns:m="http://schemas.openxmlformats.org/officeDocument/2006/math" xmlns:v="urn:schemas-microsoft-com:vml" xmlns:wp14="http://schemas.microsoft.com/office/word/2010/wordprocessingDrawing" xmlns:wp="http://schemas.openxmlformats.org/drawingml/2006/wordprocessingDrawing" xmlns:w10="urn:schemas-microsoft-com:office:word" xmlns:w15="http://schemas.microsoft.com/office/word/2012/wordml" xmlns:w16cex="http://schemas.microsoft.com/office/word/2018/wordml/cex" xmlns:w16cid="http://schemas.microsoft.com/office/word/2016/wordml/cid" xmlns:w16="http://schemas.microsoft.com/office/word/2018/wordml" xmlns:w16du="http://schemas.microsoft.com/office/word/2023/wordml/word16du" xmlns:w16sdtdh="http://schemas.microsoft.com/office/word/2020/wordml/sdtdatahash" xmlns:w16sdtfl="http://schemas.microsoft.com/office/word/2024/wordml/sdtformatlock" xmlns:w16se="http://schemas.microsoft.com/office/word/2015/wordml/symex" xmlns:wpg="http://schemas.microsoft.com/office/word/2010/wordprocessingGroup" xmlns:wpi="http://schemas.microsoft.com/office/word/2010/wordprocessingInk" xmlns:wne="http://schemas.microsoft.com/office/word/2006/wordml" xmlns:wps="http://schemas.microsoft.com/office/word/2010/wordprocessingShape">
+      <w:pPr>
+        <w:pStyle w:val="KakCoverNormal"/>
+      </w:pPr>
+    </w:p>
+    <w:p xmlns:w="http://schemas.openxmlformats.org/wordprocessingml/2006/main" xmlns:w14="http://schemas.microsoft.com/office/word/2010/wordml" xmlns:wpc="http://schemas.microsoft.com/office/word/2010/wordprocessingCanvas" xmlns:cx="http://schemas.microsoft.com/office/drawing/2014/chartex" xmlns:cx1="http://schemas.microsoft.com/office/drawing/2015/9/8/chartex" xmlns:cx2="http://schemas.microsoft.com/office/drawing/2015/10/21/chartex" xmlns:cx3="http://schemas.microsoft.com/office/drawing/2016/5/9/chartex" xmlns:cx4="http://schemas.microsoft.com/office/drawing/2016/5/10/chartex" xmlns:cx5="http://schemas.microsoft.com/office/drawing/2016/5/11/chartex" xmlns:cx6="http://schemas.microsoft.com/office/drawing/2016/5/12/chartex" xmlns:cx7="http://schemas.microsoft.com/office/drawing/2016/5/13/chartex" xmlns:cx8="http://schemas.microsoft.com/office/drawing/2016/5/14/chartex" xmlns:mc="http://schemas.openxmlformats.org/markup-compatibility/2006" xmlns:aink="http://schemas.microsoft.com/office/drawing/2016/ink" xmlns:am3d="http://schemas.microsoft.com/office/drawing/2017/model3d" xmlns:o="urn:schemas-microsoft-com:office:office" xmlns:oel="http://schemas.microsoft.com/office/2019/extlst" xmlns:r="http://schemas.openxmlformats.org/officeDocument/2006/relationships" xmlns:m="http://schemas.openxmlformats.org/officeDocument/2006/math" xmlns:v="urn:schemas-microsoft-com:vml" xmlns:wp14="http://schemas.microsoft.com/office/word/2010/wordprocessingDrawing" xmlns:wp="http://schemas.openxmlformats.org/drawingml/2006/wordprocessingDrawing" xmlns:w10="urn:schemas-microsoft-com:office:word" xmlns:w15="http://schemas.microsoft.com/office/word/2012/wordml" xmlns:w16cex="http://schemas.microsoft.com/office/word/2018/wordml/cex" xmlns:w16cid="http://schemas.microsoft.com/office/word/2016/wordml/cid" xmlns:w16="http://schemas.microsoft.com/office/word/2018/wordml" xmlns:w16du="http://schemas.microsoft.com/office/word/2023/wordml/word16du" xmlns:w16sdtdh="http://schemas.microsoft.com/office/word/2020/wordml/sdtdatahash" xmlns:w16sdtfl="http://schemas.microsoft.com/office/word/2024/wordml/sdtformatlock" xmlns:w16se="http://schemas.microsoft.com/office/word/2015/wordml/symex" xmlns:wpg="http://schemas.microsoft.com/office/word/2010/wordprocessingGroup" xmlns:wpi="http://schemas.microsoft.com/office/word/2010/wordprocessingInk" xmlns:wne="http://schemas.microsoft.com/office/word/2006/wordml" xmlns:wps="http://schemas.microsoft.com/office/word/2010/wordprocessingShape">
+      <w:pPr>
+        <w:pStyle w:val="KakCoverNormal"/>
+      </w:pPr>
+    </w:p>
+    <w:p xmlns:w="http://schemas.openxmlformats.org/wordprocessingml/2006/main" xmlns:w14="http://schemas.microsoft.com/office/word/2010/wordml" xmlns:wpc="http://schemas.microsoft.com/office/word/2010/wordprocessingCanvas" xmlns:cx="http://schemas.microsoft.com/office/drawing/2014/chartex" xmlns:cx1="http://schemas.microsoft.com/office/drawing/2015/9/8/chartex" xmlns:cx2="http://schemas.microsoft.com/office/drawing/2015/10/21/chartex" xmlns:cx3="http://schemas.microsoft.com/office/drawing/2016/5/9/chartex" xmlns:cx4="http://schemas.microsoft.com/office/drawing/2016/5/10/chartex" xmlns:cx5="http://schemas.microsoft.com/office/drawing/2016/5/11/chartex" xmlns:cx6="http://schemas.microsoft.com/office/drawing/2016/5/12/chartex" xmlns:cx7="http://schemas.microsoft.com/office/drawing/2016/5/13/chartex" xmlns:cx8="http://schemas.microsoft.com/office/drawing/2016/5/14/chartex" xmlns:mc="http://schemas.openxmlformats.org/markup-compatibility/2006" xmlns:aink="http://schemas.microsoft.com/office/drawing/2016/ink" xmlns:am3d="http://schemas.microsoft.com/office/drawing/2017/model3d" xmlns:o="urn:schemas-microsoft-com:office:office" xmlns:oel="http://schemas.microsoft.com/office/2019/extlst" xmlns:r="http://schemas.openxmlformats.org/officeDocument/2006/relationships" xmlns:m="http://schemas.openxmlformats.org/officeDocument/2006/math" xmlns:v="urn:schemas-microsoft-com:vml" xmlns:wp14="http://schemas.microsoft.com/office/word/2010/wordprocessingDrawing" xmlns:wp="http://schemas.openxmlformats.org/drawingml/2006/wordprocessingDrawing" xmlns:w10="urn:schemas-microsoft-com:office:word" xmlns:w15="http://schemas.microsoft.com/office/word/2012/wordml" xmlns:w16cex="http://schemas.microsoft.com/office/word/2018/wordml/cex" xmlns:w16cid="http://schemas.microsoft.com/office/word/2016/wordml/cid" xmlns:w16="http://schemas.microsoft.com/office/word/2018/wordml" xmlns:w16du="http://schemas.microsoft.com/office/word/2023/wordml/word16du" xmlns:w16sdtdh="http://schemas.microsoft.com/office/word/2020/wordml/sdtdatahash" xmlns:w16sdtfl="http://schemas.microsoft.com/office/word/2024/wordml/sdtformatlock" xmlns:w16se="http://schemas.microsoft.com/office/word/2015/wordml/symex" xmlns:wpg="http://schemas.microsoft.com/office/word/2010/wordprocessingGroup" xmlns:wpi="http://schemas.microsoft.com/office/word/2010/wordprocessingInk" xmlns:wne="http://schemas.microsoft.com/office/word/2006/wordml" xmlns:wps="http://schemas.microsoft.com/office/word/2010/wordprocessingShape">
+      <w:pPr>
+        <w:pStyle w:val="KakCoverNormal"/>
+      </w:pPr>
+    </w:p>
+    <w:p xmlns:w="http://schemas.openxmlformats.org/wordprocessingml/2006/main" xmlns:w14="http://schemas.microsoft.com/office/word/2010/wordml" xmlns:wpc="http://schemas.microsoft.com/office/word/2010/wordprocessingCanvas" xmlns:cx="http://schemas.microsoft.com/office/drawing/2014/chartex" xmlns:cx1="http://schemas.microsoft.com/office/drawing/2015/9/8/chartex" xmlns:cx2="http://schemas.microsoft.com/office/drawing/2015/10/21/chartex" xmlns:cx3="http://schemas.microsoft.com/office/drawing/2016/5/9/chartex" xmlns:cx4="http://schemas.microsoft.com/office/drawing/2016/5/10/chartex" xmlns:cx5="http://schemas.microsoft.com/office/drawing/2016/5/11/chartex" xmlns:cx6="http://schemas.microsoft.com/office/drawing/2016/5/12/chartex" xmlns:cx7="http://schemas.microsoft.com/office/drawing/2016/5/13/chartex" xmlns:cx8="http://schemas.microsoft.com/office/drawing/2016/5/14/chartex" xmlns:mc="http://schemas.openxmlformats.org/markup-compatibility/2006" xmlns:aink="http://schemas.microsoft.com/office/drawing/2016/ink" xmlns:am3d="http://schemas.microsoft.com/office/drawing/2017/model3d" xmlns:o="urn:schemas-microsoft-com:office:office" xmlns:oel="http://schemas.microsoft.com/office/2019/extlst" xmlns:r="http://schemas.openxmlformats.org/officeDocument/2006/relationships" xmlns:m="http://schemas.openxmlformats.org/officeDocument/2006/math" xmlns:v="urn:schemas-microsoft-com:vml" xmlns:wp14="http://schemas.microsoft.com/office/word/2010/wordprocessingDrawing" xmlns:wp="http://schemas.openxmlformats.org/drawingml/2006/wordprocessingDrawing" xmlns:w10="urn:schemas-microsoft-com:office:word" xmlns:w15="http://schemas.microsoft.com/office/word/2012/wordml" xmlns:w16cex="http://schemas.microsoft.com/office/word/2018/wordml/cex" xmlns:w16cid="http://schemas.microsoft.com/office/word/2016/wordml/cid" xmlns:w16="http://schemas.microsoft.com/office/word/2018/wordml" xmlns:w16du="http://schemas.microsoft.com/office/word/2023/wordml/word16du" xmlns:w16sdtdh="http://schemas.microsoft.com/office/word/2020/wordml/sdtdatahash" xmlns:w16sdtfl="http://schemas.microsoft.com/office/word/2024/wordml/sdtformatlock" xmlns:w16se="http://schemas.microsoft.com/office/word/2015/wordml/symex" xmlns:wpg="http://schemas.microsoft.com/office/word/2010/wordprocessingGroup" xmlns:wpi="http://schemas.microsoft.com/office/word/2010/wordprocessingInk" xmlns:wne="http://schemas.microsoft.com/office/word/2006/wordml" xmlns:wps="http://schemas.microsoft.com/office/word/2010/wordprocessingShape">
+      <w:pPr>
+        <w:pStyle w:val="KakCoverNormal"/>
+      </w:pPr>
+    </w:p>
+    <w:p xmlns:w="http://schemas.openxmlformats.org/wordprocessingml/2006/main" xmlns:w14="http://schemas.microsoft.com/office/word/2010/wordml" xmlns:wpc="http://schemas.microsoft.com/office/word/2010/wordprocessingCanvas" xmlns:cx="http://schemas.microsoft.com/office/drawing/2014/chartex" xmlns:cx1="http://schemas.microsoft.com/office/drawing/2015/9/8/chartex" xmlns:cx2="http://schemas.microsoft.com/office/drawing/2015/10/21/chartex" xmlns:cx3="http://schemas.microsoft.com/office/drawing/2016/5/9/chartex" xmlns:cx4="http://schemas.microsoft.com/office/drawing/2016/5/10/chartex" xmlns:cx5="http://schemas.microsoft.com/office/drawing/2016/5/11/chartex" xmlns:cx6="http://schemas.microsoft.com/office/drawing/2016/5/12/chartex" xmlns:cx7="http://schemas.microsoft.com/office/drawing/2016/5/13/chartex" xmlns:cx8="http://schemas.microsoft.com/office/drawing/2016/5/14/chartex" xmlns:mc="http://schemas.openxmlformats.org/markup-compatibility/2006" xmlns:aink="http://schemas.microsoft.com/office/drawing/2016/ink" xmlns:am3d="http://schemas.microsoft.com/office/drawing/2017/model3d" xmlns:o="urn:schemas-microsoft-com:office:office" xmlns:oel="http://schemas.microsoft.com/office/2019/extlst" xmlns:r="http://schemas.openxmlformats.org/officeDocument/2006/relationships" xmlns:m="http://schemas.openxmlformats.org/officeDocument/2006/math" xmlns:v="urn:schemas-microsoft-com:vml" xmlns:wp14="http://schemas.microsoft.com/office/word/2010/wordprocessingDrawing" xmlns:wp="http://schemas.openxmlformats.org/drawingml/2006/wordprocessingDrawing" xmlns:w10="urn:schemas-microsoft-com:office:word" xmlns:w15="http://schemas.microsoft.com/office/word/2012/wordml" xmlns:w16cex="http://schemas.microsoft.com/office/word/2018/wordml/cex" xmlns:w16cid="http://schemas.microsoft.com/office/word/2016/wordml/cid" xmlns:w16="http://schemas.microsoft.com/office/word/2018/wordml" xmlns:w16du="http://schemas.microsoft.com/office/word/2023/wordml/word16du" xmlns:w16sdtdh="http://schemas.microsoft.com/office/word/2020/wordml/sdtdatahash" xmlns:w16sdtfl="http://schemas.microsoft.com/office/word/2024/wordml/sdtformatlock" xmlns:w16se="http://schemas.microsoft.com/office/word/2015/wordml/symex" xmlns:wpg="http://schemas.microsoft.com/office/word/2010/wordprocessingGroup" xmlns:wpi="http://schemas.microsoft.com/office/word/2010/wordprocessingInk" xmlns:wne="http://schemas.microsoft.com/office/word/2006/wordml" xmlns:wps="http://schemas.microsoft.com/office/word/2010/wordprocessingShape">
+      <w:pPr>
+        <w:pStyle w:val="KakCoverNormal"/>
+      </w:pPr>
+    </w:p>
+    <w:p xmlns:w="http://schemas.openxmlformats.org/wordprocessingml/2006/main" xmlns:w14="http://schemas.microsoft.com/office/word/2010/wordml" xmlns:wpc="http://schemas.microsoft.com/office/word/2010/wordprocessingCanvas" xmlns:cx="http://schemas.microsoft.com/office/drawing/2014/chartex" xmlns:cx1="http://schemas.microsoft.com/office/drawing/2015/9/8/chartex" xmlns:cx2="http://schemas.microsoft.com/office/drawing/2015/10/21/chartex" xmlns:cx3="http://schemas.microsoft.com/office/drawing/2016/5/9/chartex" xmlns:cx4="http://schemas.microsoft.com/office/drawing/2016/5/10/chartex" xmlns:cx5="http://schemas.microsoft.com/office/drawing/2016/5/11/chartex" xmlns:cx6="http://schemas.microsoft.com/office/drawing/2016/5/12/chartex" xmlns:cx7="http://schemas.microsoft.com/office/drawing/2016/5/13/chartex" xmlns:cx8="http://schemas.microsoft.com/office/drawing/2016/5/14/chartex" xmlns:mc="http://schemas.openxmlformats.org/markup-compatibility/2006" xmlns:aink="http://schemas.microsoft.com/office/drawing/2016/ink" xmlns:am3d="http://schemas.microsoft.com/office/drawing/2017/model3d" xmlns:o="urn:schemas-microsoft-com:office:office" xmlns:oel="http://schemas.microsoft.com/office/2019/extlst" xmlns:r="http://schemas.openxmlformats.org/officeDocument/2006/relationships" xmlns:m="http://schemas.openxmlformats.org/officeDocument/2006/math" xmlns:v="urn:schemas-microsoft-com:vml" xmlns:wp14="http://schemas.microsoft.com/office/word/2010/wordprocessingDrawing" xmlns:wp="http://schemas.openxmlformats.org/drawingml/2006/wordprocessingDrawing" xmlns:w10="urn:schemas-microsoft-com:office:word" xmlns:w15="http://schemas.microsoft.com/office/word/2012/wordml" xmlns:w16cex="http://schemas.microsoft.com/office/word/2018/wordml/cex" xmlns:w16cid="http://schemas.microsoft.com/office/word/2016/wordml/cid" xmlns:w16="http://schemas.microsoft.com/office/word/2018/wordml" xmlns:w16du="http://schemas.microsoft.com/office/word/2023/wordml/word16du" xmlns:w16sdtdh="http://schemas.microsoft.com/office/word/2020/wordml/sdtdatahash" xmlns:w16sdtfl="http://schemas.microsoft.com/office/word/2024/wordml/sdtformatlock" xmlns:w16se="http://schemas.microsoft.com/office/word/2015/wordml/symex" xmlns:wpg="http://schemas.microsoft.com/office/word/2010/wordprocessingGroup" xmlns:wpi="http://schemas.microsoft.com/office/word/2010/wordprocessingInk" xmlns:wne="http://schemas.microsoft.com/office/word/2006/wordml" xmlns:wps="http://schemas.microsoft.com/office/word/2010/wordprocessingShape">
+      <w:pPr>
+        <w:pStyle w:val="KakCoverNormal"/>
+      </w:pPr>
+    </w:p>
+    <w:p xmlns:w="http://schemas.openxmlformats.org/wordprocessingml/2006/main" xmlns:w14="http://schemas.microsoft.com/office/word/2010/wordml" xmlns:wpc="http://schemas.microsoft.com/office/word/2010/wordprocessingCanvas" xmlns:cx="http://schemas.microsoft.com/office/drawing/2014/chartex" xmlns:cx1="http://schemas.microsoft.com/office/drawing/2015/9/8/chartex" xmlns:cx2="http://schemas.microsoft.com/office/drawing/2015/10/21/chartex" xmlns:cx3="http://schemas.microsoft.com/office/drawing/2016/5/9/chartex" xmlns:cx4="http://schemas.microsoft.com/office/drawing/2016/5/10/chartex" xmlns:cx5="http://schemas.microsoft.com/office/drawing/2016/5/11/chartex" xmlns:cx6="http://schemas.microsoft.com/office/drawing/2016/5/12/chartex" xmlns:cx7="http://schemas.microsoft.com/office/drawing/2016/5/13/chartex" xmlns:cx8="http://schemas.microsoft.com/office/drawing/2016/5/14/chartex" xmlns:mc="http://schemas.openxmlformats.org/markup-compatibility/2006" xmlns:aink="http://schemas.microsoft.com/office/drawing/2016/ink" xmlns:am3d="http://schemas.microsoft.com/office/drawing/2017/model3d" xmlns:o="urn:schemas-microsoft-com:office:office" xmlns:oel="http://schemas.microsoft.com/office/2019/extlst" xmlns:r="http://schemas.openxmlformats.org/officeDocument/2006/relationships" xmlns:m="http://schemas.openxmlformats.org/officeDocument/2006/math" xmlns:v="urn:schemas-microsoft-com:vml" xmlns:wp14="http://schemas.microsoft.com/office/word/2010/wordprocessingDrawing" xmlns:wp="http://schemas.openxmlformats.org/drawingml/2006/wordprocessingDrawing" xmlns:w10="urn:schemas-microsoft-com:office:word" xmlns:w15="http://schemas.microsoft.com/office/word/2012/wordml" xmlns:w16cex="http://schemas.microsoft.com/office/word/2018/wordml/cex" xmlns:w16cid="http://schemas.microsoft.com/office/word/2016/wordml/cid" xmlns:w16="http://schemas.microsoft.com/office/word/2018/wordml" xmlns:w16du="http://schemas.microsoft.com/office/word/2023/wordml/word16du" xmlns:w16sdtdh="http://schemas.microsoft.com/office/word/2020/wordml/sdtdatahash" xmlns:w16sdtfl="http://schemas.microsoft.com/office/word/2024/wordml/sdtformatlock" xmlns:w16se="http://schemas.microsoft.com/office/word/2015/wordml/symex" xmlns:wpg="http://schemas.microsoft.com/office/word/2010/wordprocessingGroup" xmlns:wpi="http://schemas.microsoft.com/office/word/2010/wordprocessingInk" xmlns:wne="http://schemas.microsoft.com/office/word/2006/wordml" xmlns:wps="http://schemas.microsoft.com/office/word/2010/wordprocessingShape">
+      <w:pPr>
+        <w:pStyle w:val="KakCoverNormal"/>
+      </w:pPr>
+    </w:p>
+    <w:p xmlns:w="http://schemas.openxmlformats.org/wordprocessingml/2006/main" xmlns:w14="http://schemas.microsoft.com/office/word/2010/wordml" xmlns:wpc="http://schemas.microsoft.com/office/word/2010/wordprocessingCanvas" xmlns:cx="http://schemas.microsoft.com/office/drawing/2014/chartex" xmlns:cx1="http://schemas.microsoft.com/office/drawing/2015/9/8/chartex" xmlns:cx2="http://schemas.microsoft.com/office/drawing/2015/10/21/chartex" xmlns:cx3="http://schemas.microsoft.com/office/drawing/2016/5/9/chartex" xmlns:cx4="http://schemas.microsoft.com/office/drawing/2016/5/10/chartex" xmlns:cx5="http://schemas.microsoft.com/office/drawing/2016/5/11/chartex" xmlns:cx6="http://schemas.microsoft.com/office/drawing/2016/5/12/chartex" xmlns:cx7="http://schemas.microsoft.com/office/drawing/2016/5/13/chartex" xmlns:cx8="http://schemas.microsoft.com/office/drawing/2016/5/14/chartex" xmlns:mc="http://schemas.openxmlformats.org/markup-compatibility/2006" xmlns:aink="http://schemas.microsoft.com/office/drawing/2016/ink" xmlns:am3d="http://schemas.microsoft.com/office/drawing/2017/model3d" xmlns:o="urn:schemas-microsoft-com:office:office" xmlns:oel="http://schemas.microsoft.com/office/2019/extlst" xmlns:r="http://schemas.openxmlformats.org/officeDocument/2006/relationships" xmlns:m="http://schemas.openxmlformats.org/officeDocument/2006/math" xmlns:v="urn:schemas-microsoft-com:vml" xmlns:wp14="http://schemas.microsoft.com/office/word/2010/wordprocessingDrawing" xmlns:wp="http://schemas.openxmlformats.org/drawingml/2006/wordprocessingDrawing" xmlns:w10="urn:schemas-microsoft-com:office:word" xmlns:w15="http://schemas.microsoft.com/office/word/2012/wordml" xmlns:w16cex="http://schemas.microsoft.com/office/word/2018/wordml/cex" xmlns:w16cid="http://schemas.microsoft.com/office/word/2016/wordml/cid" xmlns:w16="http://schemas.microsoft.com/office/word/2018/wordml" xmlns:w16du="http://schemas.microsoft.com/office/word/2023/wordml/word16du" xmlns:w16sdtdh="http://schemas.microsoft.com/office/word/2020/wordml/sdtdatahash" xmlns:w16sdtfl="http://schemas.microsoft.com/office/word/2024/wordml/sdtformatlock" xmlns:w16se="http://schemas.microsoft.com/office/word/2015/wordml/symex" xmlns:wpg="http://schemas.microsoft.com/office/word/2010/wordprocessingGroup" xmlns:wpi="http://schemas.microsoft.com/office/word/2010/wordprocessingInk" xmlns:wne="http://schemas.microsoft.com/office/word/2006/wordml" xmlns:wps="http://schemas.microsoft.com/office/word/2010/wordprocessingShape">
+      <w:pPr>
+        <w:pStyle w:val="KakCoverNormal"/>
+      </w:pPr>
+    </w:p>
+    <w:p xmlns:w="http://schemas.openxmlformats.org/wordprocessingml/2006/main" xmlns:w14="http://schemas.microsoft.com/office/word/2010/wordml" xmlns:wpc="http://schemas.microsoft.com/office/word/2010/wordprocessingCanvas" xmlns:cx="http://schemas.microsoft.com/office/drawing/2014/chartex" xmlns:cx1="http://schemas.microsoft.com/office/drawing/2015/9/8/chartex" xmlns:cx2="http://schemas.microsoft.com/office/drawing/2015/10/21/chartex" xmlns:cx3="http://schemas.microsoft.com/office/drawing/2016/5/9/chartex" xmlns:cx4="http://schemas.microsoft.com/office/drawing/2016/5/10/chartex" xmlns:cx5="http://schemas.microsoft.com/office/drawing/2016/5/11/chartex" xmlns:cx6="http://schemas.microsoft.com/office/drawing/2016/5/12/chartex" xmlns:cx7="http://schemas.microsoft.com/office/drawing/2016/5/13/chartex" xmlns:cx8="http://schemas.microsoft.com/office/drawing/2016/5/14/chartex" xmlns:mc="http://schemas.openxmlformats.org/markup-compatibility/2006" xmlns:aink="http://schemas.microsoft.com/office/drawing/2016/ink" xmlns:am3d="http://schemas.microsoft.com/office/drawing/2017/model3d" xmlns:o="urn:schemas-microsoft-com:office:office" xmlns:oel="http://schemas.microsoft.com/office/2019/extlst" xmlns:r="http://schemas.openxmlformats.org/officeDocument/2006/relationships" xmlns:m="http://schemas.openxmlformats.org/officeDocument/2006/math" xmlns:v="urn:schemas-microsoft-com:vml" xmlns:wp14="http://schemas.microsoft.com/office/word/2010/wordprocessingDrawing" xmlns:wp="http://schemas.openxmlformats.org/drawingml/2006/wordprocessingDrawing" xmlns:w10="urn:schemas-microsoft-com:office:word" xmlns:w15="http://schemas.microsoft.com/office/word/2012/wordml" xmlns:w16cex="http://schemas.microsoft.com/office/word/2018/wordml/cex" xmlns:w16cid="http://schemas.microsoft.com/office/word/2016/wordml/cid" xmlns:w16="http://schemas.microsoft.com/office/word/2018/wordml" xmlns:w16du="http://schemas.microsoft.com/office/word/2023/wordml/word16du" xmlns:w16sdtdh="http://schemas.microsoft.com/office/word/2020/wordml/sdtdatahash" xmlns:w16sdtfl="http://schemas.microsoft.com/office/word/2024/wordml/sdtformatlock" xmlns:w16se="http://schemas.microsoft.com/office/word/2015/wordml/symex" xmlns:wpg="http://schemas.microsoft.com/office/word/2010/wordprocessingGroup" xmlns:wpi="http://schemas.microsoft.com/office/word/2010/wordprocessingInk" xmlns:wne="http://schemas.microsoft.com/office/word/2006/wordml" xmlns:wps="http://schemas.microsoft.com/office/word/2010/wordprocessingShape">
+      <w:pPr>
+        <w:pStyle w:val="KakCoverNormal"/>
+      </w:pPr>
+    </w:p>
+    <w:p xmlns:w="http://schemas.openxmlformats.org/wordprocessingml/2006/main" xmlns:w14="http://schemas.microsoft.com/office/word/2010/wordml" xmlns:wpc="http://schemas.microsoft.com/office/word/2010/wordprocessingCanvas" xmlns:cx="http://schemas.microsoft.com/office/drawing/2014/chartex" xmlns:cx1="http://schemas.microsoft.com/office/drawing/2015/9/8/chartex" xmlns:cx2="http://schemas.microsoft.com/office/drawing/2015/10/21/chartex" xmlns:cx3="http://schemas.microsoft.com/office/drawing/2016/5/9/chartex" xmlns:cx4="http://schemas.microsoft.com/office/drawing/2016/5/10/chartex" xmlns:cx5="http://schemas.microsoft.com/office/drawing/2016/5/11/chartex" xmlns:cx6="http://schemas.microsoft.com/office/drawing/2016/5/12/chartex" xmlns:cx7="http://schemas.microsoft.com/office/drawing/2016/5/13/chartex" xmlns:cx8="http://schemas.microsoft.com/office/drawing/2016/5/14/chartex" xmlns:mc="http://schemas.openxmlformats.org/markup-compatibility/2006" xmlns:aink="http://schemas.microsoft.com/office/drawing/2016/ink" xmlns:am3d="http://schemas.microsoft.com/office/drawing/2017/model3d" xmlns:o="urn:schemas-microsoft-com:office:office" xmlns:oel="http://schemas.microsoft.com/office/2019/extlst" xmlns:r="http://schemas.openxmlformats.org/officeDocument/2006/relationships" xmlns:m="http://schemas.openxmlformats.org/officeDocument/2006/math" xmlns:v="urn:schemas-microsoft-com:vml" xmlns:wp14="http://schemas.microsoft.com/office/word/2010/wordprocessingDrawing" xmlns:wp="http://schemas.openxmlformats.org/drawingml/2006/wordprocessingDrawing" xmlns:w10="urn:schemas-microsoft-com:office:word" xmlns:w15="http://schemas.microsoft.com/office/word/2012/wordml" xmlns:w16cex="http://schemas.microsoft.com/office/word/2018/wordml/cex" xmlns:w16cid="http://schemas.microsoft.com/office/word/2016/wordml/cid" xmlns:w16="http://schemas.microsoft.com/office/word/2018/wordml" xmlns:w16du="http://schemas.microsoft.com/office/word/2023/wordml/word16du" xmlns:w16sdtdh="http://schemas.microsoft.com/office/word/2020/wordml/sdtdatahash" xmlns:w16sdtfl="http://schemas.microsoft.com/office/word/2024/wordml/sdtformatlock" xmlns:w16se="http://schemas.microsoft.com/office/word/2015/wordml/symex" xmlns:wpg="http://schemas.microsoft.com/office/word/2010/wordprocessingGroup" xmlns:wpi="http://schemas.microsoft.com/office/word/2010/wordprocessingInk" xmlns:wne="http://schemas.microsoft.com/office/word/2006/wordml" xmlns:wps="http://schemas.microsoft.com/office/word/2010/wordprocessingShape">
+      <w:pPr>
+        <w:pStyle w:val="KakCoverNormal"/>
+      </w:pPr>
+    </w:p>
+    <w:p xmlns:w="http://schemas.openxmlformats.org/wordprocessingml/2006/main" xmlns:w14="http://schemas.microsoft.com/office/word/2010/wordml" xmlns:wpc="http://schemas.microsoft.com/office/word/2010/wordprocessingCanvas" xmlns:cx="http://schemas.microsoft.com/office/drawing/2014/chartex" xmlns:cx1="http://schemas.microsoft.com/office/drawing/2015/9/8/chartex" xmlns:cx2="http://schemas.microsoft.com/office/drawing/2015/10/21/chartex" xmlns:cx3="http://schemas.microsoft.com/office/drawing/2016/5/9/chartex" xmlns:cx4="http://schemas.microsoft.com/office/drawing/2016/5/10/chartex" xmlns:cx5="http://schemas.microsoft.com/office/drawing/2016/5/11/chartex" xmlns:cx6="http://schemas.microsoft.com/office/drawing/2016/5/12/chartex" xmlns:cx7="http://schemas.microsoft.com/office/drawing/2016/5/13/chartex" xmlns:cx8="http://schemas.microsoft.com/office/drawing/2016/5/14/chartex" xmlns:mc="http://schemas.openxmlformats.org/markup-compatibility/2006" xmlns:aink="http://schemas.microsoft.com/office/drawing/2016/ink" xmlns:am3d="http://schemas.microsoft.com/office/drawing/2017/model3d" xmlns:o="urn:schemas-microsoft-com:office:office" xmlns:oel="http://schemas.microsoft.com/office/2019/extlst" xmlns:r="http://schemas.openxmlformats.org/officeDocument/2006/relationships" xmlns:m="http://schemas.openxmlformats.org/officeDocument/2006/math" xmlns:v="urn:schemas-microsoft-com:vml" xmlns:wp14="http://schemas.microsoft.com/office/word/2010/wordprocessingDrawing" xmlns:wp="http://schemas.openxmlformats.org/drawingml/2006/wordprocessingDrawing" xmlns:w10="urn:schemas-microsoft-com:office:word" xmlns:w15="http://schemas.microsoft.com/office/word/2012/wordml" xmlns:w16cex="http://schemas.microsoft.com/office/word/2018/wordml/cex" xmlns:w16cid="http://schemas.microsoft.com/office/word/2016/wordml/cid" xmlns:w16="http://schemas.microsoft.com/office/word/2018/wordml" xmlns:w16du="http://schemas.microsoft.com/office/word/2023/wordml/word16du" xmlns:w16sdtdh="http://schemas.microsoft.com/office/word/2020/wordml/sdtdatahash" xmlns:w16sdtfl="http://schemas.microsoft.com/office/word/2024/wordml/sdtformatlock" xmlns:w16se="http://schemas.microsoft.com/office/word/2015/wordml/symex" xmlns:wpg="http://schemas.microsoft.com/office/word/2010/wordprocessingGroup" xmlns:wpi="http://schemas.microsoft.com/office/word/2010/wordprocessingInk" xmlns:wne="http://schemas.microsoft.com/office/word/2006/wordml" xmlns:wps="http://schemas.microsoft.com/office/word/2010/wordprocessingShape">
+      <w:pPr>
+        <w:pStyle w:val="KakCoverNormal"/>
+      </w:pPr>
+    </w:p>
+    <w:p xmlns:w="http://schemas.openxmlformats.org/wordprocessingml/2006/main" xmlns:w14="http://schemas.microsoft.com/office/word/2010/wordml" xmlns:wpc="http://schemas.microsoft.com/office/word/2010/wordprocessingCanvas" xmlns:cx="http://schemas.microsoft.com/office/drawing/2014/chartex" xmlns:cx1="http://schemas.microsoft.com/office/drawing/2015/9/8/chartex" xmlns:cx2="http://schemas.microsoft.com/office/drawing/2015/10/21/chartex" xmlns:cx3="http://schemas.microsoft.com/office/drawing/2016/5/9/chartex" xmlns:cx4="http://schemas.microsoft.com/office/drawing/2016/5/10/chartex" xmlns:cx5="http://schemas.microsoft.com/office/drawing/2016/5/11/chartex" xmlns:cx6="http://schemas.microsoft.com/office/drawing/2016/5/12/chartex" xmlns:cx7="http://schemas.microsoft.com/office/drawing/2016/5/13/chartex" xmlns:cx8="http://schemas.microsoft.com/office/drawing/2016/5/14/chartex" xmlns:mc="http://schemas.openxmlformats.org/markup-compatibility/2006" xmlns:aink="http://schemas.microsoft.com/office/drawing/2016/ink" xmlns:am3d="http://schemas.microsoft.com/office/drawing/2017/model3d" xmlns:o="urn:schemas-microsoft-com:office:office" xmlns:oel="http://schemas.microsoft.com/office/2019/extlst" xmlns:r="http://schemas.openxmlformats.org/officeDocument/2006/relationships" xmlns:m="http://schemas.openxmlformats.org/officeDocument/2006/math" xmlns:v="urn:schemas-microsoft-com:vml" xmlns:wp14="http://schemas.microsoft.com/office/word/2010/wordprocessingDrawing" xmlns:wp="http://schemas.openxmlformats.org/drawingml/2006/wordprocessingDrawing" xmlns:w10="urn:schemas-microsoft-com:office:word" xmlns:w15="http://schemas.microsoft.com/office/word/2012/wordml" xmlns:w16cex="http://schemas.microsoft.com/office/word/2018/wordml/cex" xmlns:w16cid="http://schemas.microsoft.com/office/word/2016/wordml/cid" xmlns:w16="http://schemas.microsoft.com/office/word/2018/wordml" xmlns:w16du="http://schemas.microsoft.com/office/word/2023/wordml/word16du" xmlns:w16sdtdh="http://schemas.microsoft.com/office/word/2020/wordml/sdtdatahash" xmlns:w16sdtfl="http://schemas.microsoft.com/office/word/2024/wordml/sdtformatlock" xmlns:w16se="http://schemas.microsoft.com/office/word/2015/wordml/symex" xmlns:wpg="http://schemas.microsoft.com/office/word/2010/wordprocessingGroup" xmlns:wpi="http://schemas.microsoft.com/office/word/2010/wordprocessingInk" xmlns:wne="http://schemas.microsoft.com/office/word/2006/wordml" xmlns:wps="http://schemas.microsoft.com/office/word/2010/wordprocessingShape">
+      <w:pPr>
+        <w:pStyle w:val="KakCoverNormal"/>
+      </w:pPr>
+    </w:p>
+    <w:p xmlns:w="http://schemas.openxmlformats.org/wordprocessingml/2006/main" xmlns:w14="http://schemas.microsoft.com/office/word/2010/wordml" xmlns:wpc="http://schemas.microsoft.com/office/word/2010/wordprocessingCanvas" xmlns:cx="http://schemas.microsoft.com/office/drawing/2014/chartex" xmlns:cx1="http://schemas.microsoft.com/office/drawing/2015/9/8/chartex" xmlns:cx2="http://schemas.microsoft.com/office/drawing/2015/10/21/chartex" xmlns:cx3="http://schemas.microsoft.com/office/drawing/2016/5/9/chartex" xmlns:cx4="http://schemas.microsoft.com/office/drawing/2016/5/10/chartex" xmlns:cx5="http://schemas.microsoft.com/office/drawing/2016/5/11/chartex" xmlns:cx6="http://schemas.microsoft.com/office/drawing/2016/5/12/chartex" xmlns:cx7="http://schemas.microsoft.com/office/drawing/2016/5/13/chartex" xmlns:cx8="http://schemas.microsoft.com/office/drawing/2016/5/14/chartex" xmlns:mc="http://schemas.openxmlformats.org/markup-compatibility/2006" xmlns:aink="http://schemas.microsoft.com/office/drawing/2016/ink" xmlns:am3d="http://schemas.microsoft.com/office/drawing/2017/model3d" xmlns:o="urn:schemas-microsoft-com:office:office" xmlns:oel="http://schemas.microsoft.com/office/2019/extlst" xmlns:r="http://schemas.openxmlformats.org/officeDocument/2006/relationships" xmlns:m="http://schemas.openxmlformats.org/officeDocument/2006/math" xmlns:v="urn:schemas-microsoft-com:vml" xmlns:wp14="http://schemas.microsoft.com/office/word/2010/wordprocessingDrawing" xmlns:wp="http://schemas.openxmlformats.org/drawingml/2006/wordprocessingDrawing" xmlns:w10="urn:schemas-microsoft-com:office:word" xmlns:w15="http://schemas.microsoft.com/office/word/2012/wordml" xmlns:w16cex="http://schemas.microsoft.com/office/word/2018/wordml/cex" xmlns:w16cid="http://schemas.microsoft.com/office/word/2016/wordml/cid" xmlns:w16="http://schemas.microsoft.com/office/word/2018/wordml" xmlns:w16du="http://schemas.microsoft.com/office/word/2023/wordml/word16du" xmlns:w16sdtdh="http://schemas.microsoft.com/office/word/2020/wordml/sdtdatahash" xmlns:w16sdtfl="http://schemas.microsoft.com/office/word/2024/wordml/sdtformatlock" xmlns:w16se="http://schemas.microsoft.com/office/word/2015/wordml/symex" xmlns:wpg="http://schemas.microsoft.com/office/word/2010/wordprocessingGroup" xmlns:wpi="http://schemas.microsoft.com/office/word/2010/wordprocessingInk" xmlns:wne="http://schemas.microsoft.com/office/word/2006/wordml" xmlns:wps="http://schemas.microsoft.com/office/word/2010/wordprocessingShape">
+      <w:pPr>
+        <w:pStyle w:val="KakCoverNormal"/>
+      </w:pPr>
+    </w:p>
+    <w:p xmlns:w="http://schemas.openxmlformats.org/wordprocessingml/2006/main" xmlns:w14="http://schemas.microsoft.com/office/word/2010/wordml" xmlns:wpc="http://schemas.microsoft.com/office/word/2010/wordprocessingCanvas" xmlns:cx="http://schemas.microsoft.com/office/drawing/2014/chartex" xmlns:cx1="http://schemas.microsoft.com/office/drawing/2015/9/8/chartex" xmlns:cx2="http://schemas.microsoft.com/office/drawing/2015/10/21/chartex" xmlns:cx3="http://schemas.microsoft.com/office/drawing/2016/5/9/chartex" xmlns:cx4="http://schemas.microsoft.com/office/drawing/2016/5/10/chartex" xmlns:cx5="http://schemas.microsoft.com/office/drawing/2016/5/11/chartex" xmlns:cx6="http://schemas.microsoft.com/office/drawing/2016/5/12/chartex" xmlns:cx7="http://schemas.microsoft.com/office/drawing/2016/5/13/chartex" xmlns:cx8="http://schemas.microsoft.com/office/drawing/2016/5/14/chartex" xmlns:mc="http://schemas.openxmlformats.org/markup-compatibility/2006" xmlns:aink="http://schemas.microsoft.com/office/drawing/2016/ink" xmlns:am3d="http://schemas.microsoft.com/office/drawing/2017/model3d" xmlns:o="urn:schemas-microsoft-com:office:office" xmlns:oel="http://schemas.microsoft.com/office/2019/extlst" xmlns:r="http://schemas.openxmlformats.org/officeDocument/2006/relationships" xmlns:m="http://schemas.openxmlformats.org/officeDocument/2006/math" xmlns:v="urn:schemas-microsoft-com:vml" xmlns:wp14="http://schemas.microsoft.com/office/word/2010/wordprocessingDrawing" xmlns:wp="http://schemas.openxmlformats.org/drawingml/2006/wordprocessingDrawing" xmlns:w10="urn:schemas-microsoft-com:office:word" xmlns:w15="http://schemas.microsoft.com/office/word/2012/wordml" xmlns:w16cex="http://schemas.microsoft.com/office/word/2018/wordml/cex" xmlns:w16cid="http://schemas.microsoft.com/office/word/2016/wordml/cid" xmlns:w16="http://schemas.microsoft.com/office/word/2018/wordml" xmlns:w16du="http://schemas.microsoft.com/office/word/2023/wordml/word16du" xmlns:w16sdtdh="http://schemas.microsoft.com/office/word/2020/wordml/sdtdatahash" xmlns:w16sdtfl="http://schemas.microsoft.com/office/word/2024/wordml/sdtformatlock" xmlns:w16se="http://schemas.microsoft.com/office/word/2015/wordml/symex" xmlns:wpg="http://schemas.microsoft.com/office/word/2010/wordprocessingGroup" xmlns:wpi="http://schemas.microsoft.com/office/word/2010/wordprocessingInk" xmlns:wne="http://schemas.microsoft.com/office/word/2006/wordml" xmlns:wps="http://schemas.microsoft.com/office/word/2010/wordprocessingShape">
+      <w:pPr>
+        <w:pStyle w:val="KakCoverNormal"/>
+        <w:jc w:val="center"/>
+        <w:rPr>
+          <w:b/>
+          <w:sz w:val="34"/>
+          <w:szCs w:val="28"/>
+        </w:rPr>
+      </w:pPr>
+      <w:r>
+        <w:rPr>
+          <w:b/>
+          <w:sz w:val="34"/>
+          <w:szCs w:val="28"/>
+        </w:rPr>
+        <w:t>PETUNJUK OPERASIONAL</w:t>
+      </w:r>
+    </w:p>
+    <w:p xmlns:w="http://schemas.openxmlformats.org/wordprocessingml/2006/main" xmlns:w14="http://schemas.microsoft.com/office/word/2010/wordml" xmlns:wpc="http://schemas.microsoft.com/office/word/2010/wordprocessingCanvas" xmlns:cx="http://schemas.microsoft.com/office/drawing/2014/chartex" xmlns:cx1="http://schemas.microsoft.com/office/drawing/2015/9/8/chartex" xmlns:cx2="http://schemas.microsoft.com/office/drawing/2015/10/21/chartex" xmlns:cx3="http://schemas.microsoft.com/office/drawing/2016/5/9/chartex" xmlns:cx4="http://schemas.microsoft.com/office/drawing/2016/5/10/chartex" xmlns:cx5="http://schemas.microsoft.com/office/drawing/2016/5/11/chartex" xmlns:cx6="http://schemas.microsoft.com/office/drawing/2016/5/12/chartex" xmlns:cx7="http://schemas.microsoft.com/office/drawing/2016/5/13/chartex" xmlns:cx8="http://schemas.microsoft.com/office/drawing/2016/5/14/chartex" xmlns:mc="http://schemas.openxmlformats.org/markup-compatibility/2006" xmlns:aink="http://schemas.microsoft.com/office/drawing/2016/ink" xmlns:am3d="http://schemas.microsoft.com/office/drawing/2017/model3d" xmlns:o="urn:schemas-microsoft-com:office:office" xmlns:oel="http://schemas.microsoft.com/office/2019/extlst" xmlns:r="http://schemas.openxmlformats.org/officeDocument/2006/relationships" xmlns:m="http://schemas.openxmlformats.org/officeDocument/2006/math" xmlns:v="urn:schemas-microsoft-com:vml" xmlns:wp14="http://schemas.microsoft.com/office/word/2010/wordprocessingDrawing" xmlns:wp="http://schemas.openxmlformats.org/drawingml/2006/wordprocessingDrawing" xmlns:w10="urn:schemas-microsoft-com:office:word" xmlns:w15="http://schemas.microsoft.com/office/word/2012/wordml" xmlns:w16cex="http://schemas.microsoft.com/office/word/2018/wordml/cex" xmlns:w16cid="http://schemas.microsoft.com/office/word/2016/wordml/cid" xmlns:w16="http://schemas.microsoft.com/office/word/2018/wordml" xmlns:w16du="http://schemas.microsoft.com/office/word/2023/wordml/word16du" xmlns:w16sdtdh="http://schemas.microsoft.com/office/word/2020/wordml/sdtdatahash" xmlns:w16sdtfl="http://schemas.microsoft.com/office/word/2024/wordml/sdtformatlock" xmlns:w16se="http://schemas.microsoft.com/office/word/2015/wordml/symex" xmlns:wpg="http://schemas.microsoft.com/office/word/2010/wordprocessingGroup" xmlns:wpi="http://schemas.microsoft.com/office/word/2010/wordprocessingInk" xmlns:wne="http://schemas.microsoft.com/office/word/2006/wordml" xmlns:wps="http://schemas.microsoft.com/office/word/2010/wordprocessingShape">
+      <w:pPr>
+        <w:pStyle w:val="KakCoverNormal"/>
+        <w:rPr>
+          <w:sz w:val="28"/>
+          <w:szCs w:val="28"/>
+        </w:rPr>
+      </w:pPr>
+    </w:p>
+    <w:p xmlns:w="http://schemas.openxmlformats.org/wordprocessingml/2006/main" xmlns:w14="http://schemas.microsoft.com/office/word/2010/wordml" xmlns:wpc="http://schemas.microsoft.com/office/word/2010/wordprocessingCanvas" xmlns:cx="http://schemas.microsoft.com/office/drawing/2014/chartex" xmlns:cx1="http://schemas.microsoft.com/office/drawing/2015/9/8/chartex" xmlns:cx2="http://schemas.microsoft.com/office/drawing/2015/10/21/chartex" xmlns:cx3="http://schemas.microsoft.com/office/drawing/2016/5/9/chartex" xmlns:cx4="http://schemas.microsoft.com/office/drawing/2016/5/10/chartex" xmlns:cx5="http://schemas.microsoft.com/office/drawing/2016/5/11/chartex" xmlns:cx6="http://schemas.microsoft.com/office/drawing/2016/5/12/chartex" xmlns:cx7="http://schemas.microsoft.com/office/drawing/2016/5/13/chartex" xmlns:cx8="http://schemas.microsoft.com/office/drawing/2016/5/14/chartex" xmlns:mc="http://schemas.openxmlformats.org/markup-compatibility/2006" xmlns:aink="http://schemas.microsoft.com/office/drawing/2016/ink" xmlns:am3d="http://schemas.microsoft.com/office/drawing/2017/model3d" xmlns:o="urn:schemas-microsoft-com:office:office" xmlns:oel="http://schemas.microsoft.com/office/2019/extlst" xmlns:r="http://schemas.openxmlformats.org/officeDocument/2006/relationships" xmlns:m="http://schemas.openxmlformats.org/officeDocument/2006/math" xmlns:v="urn:schemas-microsoft-com:vml" xmlns:wp14="http://schemas.microsoft.com/office/word/2010/wordprocessingDrawing" xmlns:wp="http://schemas.openxmlformats.org/drawingml/2006/wordprocessingDrawing" xmlns:w10="urn:schemas-microsoft-com:office:word" xmlns:w15="http://schemas.microsoft.com/office/word/2012/wordml" xmlns:w16cex="http://schemas.microsoft.com/office/word/2018/wordml/cex" xmlns:w16cid="http://schemas.microsoft.com/office/word/2016/wordml/cid" xmlns:w16="http://schemas.microsoft.com/office/word/2018/wordml" xmlns:w16du="http://schemas.microsoft.com/office/word/2023/wordml/word16du" xmlns:w16sdtdh="http://schemas.microsoft.com/office/word/2020/wordml/sdtdatahash" xmlns:w16sdtfl="http://schemas.microsoft.com/office/word/2024/wordml/sdtformatlock" xmlns:w16se="http://schemas.microsoft.com/office/word/2015/wordml/symex" xmlns:wpg="http://schemas.microsoft.com/office/word/2010/wordprocessingGroup" xmlns:wpi="http://schemas.microsoft.com/office/word/2010/wordprocessingInk" xmlns:wne="http://schemas.microsoft.com/office/word/2006/wordml" xmlns:wps="http://schemas.microsoft.com/office/word/2010/wordprocessingShape">
+      <w:pPr>
+        <w:pStyle w:val="KakCoverNormal"/>
+        <w:rPr>
+          <w:sz w:val="28"/>
+          <w:szCs w:val="28"/>
+        </w:rPr>
+      </w:pPr>
+    </w:p>
+    <w:p xmlns:w="http://schemas.openxmlformats.org/wordprocessingml/2006/main" xmlns:w14="http://schemas.microsoft.com/office/word/2010/wordml" xmlns:wpc="http://schemas.microsoft.com/office/word/2010/wordprocessingCanvas" xmlns:cx="http://schemas.microsoft.com/office/drawing/2014/chartex" xmlns:cx1="http://schemas.microsoft.com/office/drawing/2015/9/8/chartex" xmlns:cx2="http://schemas.microsoft.com/office/drawing/2015/10/21/chartex" xmlns:cx3="http://schemas.microsoft.com/office/drawing/2016/5/9/chartex" xmlns:cx4="http://schemas.microsoft.com/office/drawing/2016/5/10/chartex" xmlns:cx5="http://schemas.microsoft.com/office/drawing/2016/5/11/chartex" xmlns:cx6="http://schemas.microsoft.com/office/drawing/2016/5/12/chartex" xmlns:cx7="http://schemas.microsoft.com/office/drawing/2016/5/13/chartex" xmlns:cx8="http://schemas.microsoft.com/office/drawing/2016/5/14/chartex" xmlns:mc="http://schemas.openxmlformats.org/markup-compatibility/2006" xmlns:aink="http://schemas.microsoft.com/office/drawing/2016/ink" xmlns:am3d="http://schemas.microsoft.com/office/drawing/2017/model3d" xmlns:o="urn:schemas-microsoft-com:office:office" xmlns:oel="http://schemas.microsoft.com/office/2019/extlst" xmlns:r="http://schemas.openxmlformats.org/officeDocument/2006/relationships" xmlns:m="http://schemas.openxmlformats.org/officeDocument/2006/math" xmlns:v="urn:schemas-microsoft-com:vml" xmlns:wp14="http://schemas.microsoft.com/office/word/2010/wordprocessingDrawing" xmlns:wp="http://schemas.openxmlformats.org/drawingml/2006/wordprocessingDrawing" xmlns:w10="urn:schemas-microsoft-com:office:word" xmlns:w15="http://schemas.microsoft.com/office/word/2012/wordml" xmlns:w16cex="http://schemas.microsoft.com/office/word/2018/wordml/cex" xmlns:w16cid="http://schemas.microsoft.com/office/word/2016/wordml/cid" xmlns:w16="http://schemas.microsoft.com/office/word/2018/wordml" xmlns:w16du="http://schemas.microsoft.com/office/word/2023/wordml/word16du" xmlns:w16sdtdh="http://schemas.microsoft.com/office/word/2020/wordml/sdtdatahash" xmlns:w16sdtfl="http://schemas.microsoft.com/office/word/2024/wordml/sdtformatlock" xmlns:w16se="http://schemas.microsoft.com/office/word/2015/wordml/symex" xmlns:wpg="http://schemas.microsoft.com/office/word/2010/wordprocessingGroup" xmlns:wpi="http://schemas.microsoft.com/office/word/2010/wordprocessingInk" xmlns:wne="http://schemas.microsoft.com/office/word/2006/wordml" xmlns:wps="http://schemas.microsoft.com/office/word/2010/wordprocessingShape">
+      <w:pPr>
+        <w:pStyle w:val="KakCoverNormal"/>
+        <w:rPr>
+          <w:sz w:val="28"/>
+          <w:szCs w:val="28"/>
+        </w:rPr>
+      </w:pPr>
+    </w:p>
+    <w:p xmlns:w="http://schemas.openxmlformats.org/wordprocessingml/2006/main" xmlns:w14="http://schemas.microsoft.com/office/word/2010/wordml" xmlns:wpc="http://schemas.microsoft.com/office/word/2010/wordprocessingCanvas" xmlns:cx="http://schemas.microsoft.com/office/drawing/2014/chartex" xmlns:cx1="http://schemas.microsoft.com/office/drawing/2015/9/8/chartex" xmlns:cx2="http://schemas.microsoft.com/office/drawing/2015/10/21/chartex" xmlns:cx3="http://schemas.microsoft.com/office/drawing/2016/5/9/chartex" xmlns:cx4="http://schemas.microsoft.com/office/drawing/2016/5/10/chartex" xmlns:cx5="http://schemas.microsoft.com/office/drawing/2016/5/11/chartex" xmlns:cx6="http://schemas.microsoft.com/office/drawing/2016/5/12/chartex" xmlns:cx7="http://schemas.microsoft.com/office/drawing/2016/5/13/chartex" xmlns:cx8="http://schemas.microsoft.com/office/drawing/2016/5/14/chartex" xmlns:mc="http://schemas.openxmlformats.org/markup-compatibility/2006" xmlns:aink="http://schemas.microsoft.com/office/drawing/2016/ink" xmlns:am3d="http://schemas.microsoft.com/office/drawing/2017/model3d" xmlns:o="urn:schemas-microsoft-com:office:office" xmlns:oel="http://schemas.microsoft.com/office/2019/extlst" xmlns:r="http://schemas.openxmlformats.org/officeDocument/2006/relationships" xmlns:m="http://schemas.openxmlformats.org/officeDocument/2006/math" xmlns:v="urn:schemas-microsoft-com:vml" xmlns:wp14="http://schemas.microsoft.com/office/word/2010/wordprocessingDrawing" xmlns:wp="http://schemas.openxmlformats.org/drawingml/2006/wordprocessingDrawing" xmlns:w10="urn:schemas-microsoft-com:office:word" xmlns:w15="http://schemas.microsoft.com/office/word/2012/wordml" xmlns:w16cex="http://schemas.microsoft.com/office/word/2018/wordml/cex" xmlns:w16cid="http://schemas.microsoft.com/office/word/2016/wordml/cid" xmlns:w16="http://schemas.microsoft.com/office/word/2018/wordml" xmlns:w16du="http://schemas.microsoft.com/office/word/2023/wordml/word16du" xmlns:w16sdtdh="http://schemas.microsoft.com/office/word/2020/wordml/sdtdatahash" xmlns:w16sdtfl="http://schemas.microsoft.com/office/word/2024/wordml/sdtformatlock" xmlns:w16se="http://schemas.microsoft.com/office/word/2015/wordml/symex" xmlns:wpg="http://schemas.microsoft.com/office/word/2010/wordprocessingGroup" xmlns:wpi="http://schemas.microsoft.com/office/word/2010/wordprocessingInk" xmlns:wne="http://schemas.microsoft.com/office/word/2006/wordml" xmlns:wps="http://schemas.microsoft.com/office/word/2010/wordprocessingShape">
+      <w:pPr>
+        <w:pStyle w:val="KakCoverNormal"/>
+        <w:rPr>
+          <w:sz w:val="28"/>
+          <w:szCs w:val="28"/>
+        </w:rPr>
+      </w:pPr>
+    </w:p>
+    <w:tbl xmlns:w="http://schemas.openxmlformats.org/wordprocessingml/2006/main" xmlns:wpc="http://schemas.microsoft.com/office/word/2010/wordprocessingCanvas" xmlns:cx="http://schemas.microsoft.com/office/drawing/2014/chartex" xmlns:cx1="http://schemas.microsoft.com/office/drawing/2015/9/8/chartex" xmlns:cx2="http://schemas.microsoft.com/office/drawing/2015/10/21/chartex" xmlns:cx3="http://schemas.microsoft.com/office/drawing/2016/5/9/chartex" xmlns:cx4="http://schemas.microsoft.com/office/drawing/2016/5/10/chartex" xmlns:cx5="http://schemas.microsoft.com/office/drawing/2016/5/11/chartex" xmlns:cx6="http://schemas.microsoft.com/office/drawing/2016/5/12/chartex" xmlns:cx7="http://schemas.microsoft.com/office/drawing/2016/5/13/chartex" xmlns:cx8="http://schemas.microsoft.com/office/drawing/2016/5/14/chartex" xmlns:mc="http://schemas.openxmlformats.org/markup-compatibility/2006" xmlns:aink="http://schemas.microsoft.com/office/drawing/2016/ink" xmlns:am3d="http://schemas.microsoft.com/office/drawing/2017/model3d" xmlns:o="urn:schemas-microsoft-com:office:office" xmlns:oel="http://schemas.microsoft.com/office/2019/extlst" xmlns:r="http://schemas.openxmlformats.org/officeDocument/2006/relationships" xmlns:m="http://schemas.openxmlformats.org/officeDocument/2006/math" xmlns:v="urn:schemas-microsoft-com:vml" xmlns:wp14="http://schemas.microsoft.com/office/word/2010/wordprocessingDrawing" xmlns:wp="http://schemas.openxmlformats.org/drawingml/2006/wordprocessingDrawing" xmlns:w10="urn:schemas-microsoft-com:office:word" xmlns:w14="http://schemas.microsoft.com/office/word/2010/wordml" xmlns:w15="http://schemas.microsoft.com/office/word/2012/wordml" xmlns:w16cex="http://schemas.microsoft.com/office/word/2018/wordml/cex" xmlns:w16cid="http://schemas.microsoft.com/office/word/2016/wordml/cid" xmlns:w16="http://schemas.microsoft.com/office/word/2018/wordml" xmlns:w16du="http://schemas.microsoft.com/office/word/2023/wordml/word16du" xmlns:w16sdtdh="http://schemas.microsoft.com/office/word/2020/wordml/sdtdatahash" xmlns:w16sdtfl="http://schemas.microsoft.com/office/word/2024/wordml/sdtformatlock" xmlns:w16se="http://schemas.microsoft.com/office/word/2015/wordml/symex" xmlns:wpg="http://schemas.microsoft.com/office/word/2010/wordprocessingGroup" xmlns:wpi="http://schemas.microsoft.com/office/word/2010/wordprocessingInk" xmlns:wne="http://schemas.microsoft.com/office/word/2006/wordml" xmlns:wps="http://schemas.microsoft.com/office/word/2010/wordprocessingShape">
+      <w:tblPr>
+        <w:tblStyle w:val="KakCoverTableNormal"/>
+        <w:tblW w:w="8955" w:type="dxa"/>
+        <w:tblInd w:w="240" w:type="dxa"/>
+        <w:tblLayout w:type="fixed"/>
+        <w:tblLook w:val="0600" w:firstRow="0" w:lastRow="0" w:firstColumn="0" w:lastColumn="0" w:noHBand="1" w:noVBand="1"/>
+      </w:tblPr>
+      <w:tblGrid>
+        <w:gridCol w:w="2445"/>
+        <w:gridCol w:w="240"/>
+        <w:gridCol w:w="6270"/>
+      </w:tblGrid>
+      <w:tr>
+        <w:trPr>
+          <w:trHeight w:val="241"/>
+        </w:trPr>
+        <w:tc>
+          <w:tcPr>
+            <w:tcW w:w="2445" w:type="dxa"/>
+            <w:tcMar>
+              <w:top w:w="100" w:type="dxa"/>
+              <w:left w:w="100" w:type="dxa"/>
+              <w:bottom w:w="100" w:type="dxa"/>
+              <w:right w:w="100" w:type="dxa"/>
+            </w:tcMar>
+          </w:tcPr>
+          <w:p>
+            <w:pPr>
+              <w:pStyle w:val="KakCoverNoSpacing"/>
+              <w:rPr>
+                <w:rFonts w:ascii="Times New Roman" w:hAnsi="Times New Roman" w:cs="Times New Roman"/>
+                <w:sz w:val="24"/>
+                <w:szCs w:val="24"/>
+              </w:rPr>
+            </w:pPr>
+            <w:r>
+              <w:rPr>
+                <w:rFonts w:ascii="Times New Roman" w:hAnsi="Times New Roman" w:cs="Times New Roman"/>
+                <w:sz w:val="24"/>
+                <w:szCs w:val="24"/>
+              </w:rPr>
+              <w:t>NAMA PROGRAM</w:t>
+            </w:r>
+          </w:p>
+        </w:tc>
+        <w:tc>
+          <w:tcPr>
+            <w:tcW w:w="240" w:type="dxa"/>
+            <w:tcMar>
+              <w:top w:w="100" w:type="dxa"/>
+              <w:left w:w="100" w:type="dxa"/>
+              <w:bottom w:w="100" w:type="dxa"/>
+              <w:right w:w="100" w:type="dxa"/>
+            </w:tcMar>
+          </w:tcPr>
+          <w:p>
+            <w:pPr>
+              <w:pStyle w:val="KakCoverNoSpacing"/>
+              <w:rPr>
+                <w:rFonts w:ascii="Times New Roman" w:hAnsi="Times New Roman" w:cs="Times New Roman"/>
+                <w:sz w:val="24"/>
+                <w:szCs w:val="24"/>
+              </w:rPr>
+            </w:pPr>
+            <w:r>
+              <w:rPr>
+                <w:rFonts w:ascii="Times New Roman" w:hAnsi="Times New Roman" w:cs="Times New Roman"/>
+                <w:sz w:val="24"/>
+                <w:szCs w:val="24"/>
+              </w:rPr>
+              <w:t>:</w:t>
+            </w:r>
+          </w:p>
+        </w:tc>
+        <w:tc>
+          <w:tcPr>
+            <w:tcW w:w="6270" w:type="dxa"/>
+            <w:tcMar>
+              <w:top w:w="100" w:type="dxa"/>
+              <w:left w:w="100" w:type="dxa"/>
+              <w:bottom w:w="100" w:type="dxa"/>
+              <w:right w:w="100" w:type="dxa"/>
+            </w:tcMar>
+          </w:tcPr>
+          <w:p>
+            <w:pPr>
+              <w:pStyle w:val="KakCoverNoSpacing"/>
+              <w:jc w:val="both"/>
+              <w:rPr>
+                <w:rFonts w:ascii="Times New Roman" w:hAnsi="Times New Roman" w:cs="Times New Roman"/>
+                <w:sz w:val="24"/>
+                <w:szCs w:val="24"/>
+              </w:rPr>
+            </w:pPr>
+            <w:r>
+              <w:rPr>
+                <w:rFonts w:ascii="Times New Roman" w:hAnsi="Times New Roman" w:cs="Times New Roman"/>
+                <w:sz w:val="24"/>
+                <w:szCs w:val="24"/>
+              </w:rPr>
+              <w:t xml:space="preserve">${kak.cover.program}</w:t>
+            </w:r>
+          </w:p>
+        </w:tc>
+      </w:tr>
+      <w:tr>
+        <w:tc>
+          <w:tcPr>
+            <w:tcW w:w="2445" w:type="dxa"/>
+            <w:tcMar>
+              <w:top w:w="100" w:type="dxa"/>
+              <w:left w:w="100" w:type="dxa"/>
+              <w:bottom w:w="100" w:type="dxa"/>
+              <w:right w:w="100" w:type="dxa"/>
+            </w:tcMar>
+          </w:tcPr>
+          <w:p>
+            <w:pPr>
+              <w:pStyle w:val="KakCoverNoSpacing"/>
+              <w:rPr>
+                <w:rFonts w:ascii="Times New Roman" w:hAnsi="Times New Roman" w:cs="Times New Roman"/>
+                <w:sz w:val="24"/>
+                <w:szCs w:val="24"/>
+              </w:rPr>
+            </w:pPr>
+            <w:r>
+              <w:rPr>
+                <w:rFonts w:ascii="Times New Roman" w:hAnsi="Times New Roman" w:cs="Times New Roman"/>
+                <w:sz w:val="24"/>
+                <w:szCs w:val="24"/>
+              </w:rPr>
+              <w:t>NAMA KEGIATAN</w:t>
+            </w:r>
+          </w:p>
+        </w:tc>
+        <w:tc>
+          <w:tcPr>
+            <w:tcW w:w="240" w:type="dxa"/>
+            <w:tcMar>
+              <w:top w:w="100" w:type="dxa"/>
+              <w:left w:w="100" w:type="dxa"/>
+              <w:bottom w:w="100" w:type="dxa"/>
+              <w:right w:w="100" w:type="dxa"/>
+            </w:tcMar>
+          </w:tcPr>
+          <w:p>
+            <w:pPr>
+              <w:pStyle w:val="KakCoverNoSpacing"/>
+              <w:rPr>
+                <w:rFonts w:ascii="Times New Roman" w:hAnsi="Times New Roman" w:cs="Times New Roman"/>
+                <w:sz w:val="24"/>
+                <w:szCs w:val="24"/>
+              </w:rPr>
+            </w:pPr>
+            <w:r>
+              <w:rPr>
+                <w:rFonts w:ascii="Times New Roman" w:hAnsi="Times New Roman" w:cs="Times New Roman"/>
+                <w:sz w:val="24"/>
+                <w:szCs w:val="24"/>
+              </w:rPr>
+              <w:t>:</w:t>
+            </w:r>
+          </w:p>
+        </w:tc>
+        <w:tc>
+          <w:tcPr>
+            <w:tcW w:w="6270" w:type="dxa"/>
+            <w:tcMar>
+              <w:top w:w="100" w:type="dxa"/>
+              <w:left w:w="100" w:type="dxa"/>
+              <w:bottom w:w="100" w:type="dxa"/>
+              <w:right w:w="100" w:type="dxa"/>
+            </w:tcMar>
+          </w:tcPr>
+          <w:p>
+            <w:pPr>
+              <w:pStyle w:val="KakCoverNoSpacing"/>
+              <w:jc w:val="both"/>
+              <w:rPr>
+                <w:rFonts w:ascii="Times New Roman" w:hAnsi="Times New Roman" w:cs="Times New Roman"/>
+                <w:sz w:val="24"/>
+                <w:szCs w:val="24"/>
+              </w:rPr>
+            </w:pPr>
+            <w:r>
+              <w:rPr>
+                <w:rFonts w:ascii="Times New Roman" w:hAnsi="Times New Roman" w:cs="Times New Roman"/>
+                <w:sz w:val="24"/>
+                <w:szCs w:val="24"/>
+              </w:rPr>
+              <w:t xml:space="preserve">${kak.cover.kegiatan}</w:t>
+            </w:r>
+          </w:p>
+        </w:tc>
+      </w:tr>
+      <w:tr>
+        <w:tc>
+          <w:tcPr>
+            <w:tcW w:w="2445" w:type="dxa"/>
+            <w:tcMar>
+              <w:top w:w="100" w:type="dxa"/>
+              <w:left w:w="100" w:type="dxa"/>
+              <w:bottom w:w="100" w:type="dxa"/>
+              <w:right w:w="100" w:type="dxa"/>
+            </w:tcMar>
+          </w:tcPr>
+          <w:p>
+            <w:pPr>
+              <w:pStyle w:val="KakCoverNoSpacing"/>
+              <w:rPr>
+                <w:rFonts w:ascii="Times New Roman" w:hAnsi="Times New Roman" w:cs="Times New Roman"/>
+                <w:sz w:val="24"/>
+                <w:szCs w:val="24"/>
+              </w:rPr>
+            </w:pPr>
+            <w:r>
+              <w:rPr>
+                <w:rFonts w:ascii="Times New Roman" w:hAnsi="Times New Roman" w:cs="Times New Roman"/>
+                <w:sz w:val="24"/>
+                <w:szCs w:val="24"/>
+              </w:rPr>
+              <w:t>SUB KEGIATAN</w:t>
+            </w:r>
+          </w:p>
+        </w:tc>
+        <w:tc>
+          <w:tcPr>
+            <w:tcW w:w="240" w:type="dxa"/>
+            <w:tcMar>
+              <w:top w:w="100" w:type="dxa"/>
+              <w:left w:w="100" w:type="dxa"/>
+              <w:bottom w:w="100" w:type="dxa"/>
+              <w:right w:w="100" w:type="dxa"/>
+            </w:tcMar>
+          </w:tcPr>
+          <w:p>
+            <w:pPr>
+              <w:pStyle w:val="KakCoverNoSpacing"/>
+              <w:rPr>
+                <w:rFonts w:ascii="Times New Roman" w:hAnsi="Times New Roman" w:cs="Times New Roman"/>
+                <w:sz w:val="24"/>
+                <w:szCs w:val="24"/>
+              </w:rPr>
+            </w:pPr>
+            <w:r>
+              <w:rPr>
+                <w:rFonts w:ascii="Times New Roman" w:hAnsi="Times New Roman" w:cs="Times New Roman"/>
+                <w:sz w:val="24"/>
+                <w:szCs w:val="24"/>
+              </w:rPr>
+              <w:t>:</w:t>
+            </w:r>
+          </w:p>
+        </w:tc>
+        <w:tc>
+          <w:tcPr>
+            <w:tcW w:w="6270" w:type="dxa"/>
+            <w:tcMar>
+              <w:top w:w="100" w:type="dxa"/>
+              <w:left w:w="100" w:type="dxa"/>
+              <w:bottom w:w="100" w:type="dxa"/>
+              <w:right w:w="100" w:type="dxa"/>
+            </w:tcMar>
+          </w:tcPr>
+          <w:p>
+            <w:pPr>
+              <w:pStyle w:val="KakCoverNoSpacing"/>
+              <w:jc w:val="both"/>
+              <w:rPr>
+                <w:rFonts w:ascii="Times New Roman" w:hAnsi="Times New Roman" w:cs="Times New Roman"/>
+                <w:bCs/>
+                <w:sz w:val="24"/>
+                <w:szCs w:val="24"/>
+              </w:rPr>
+            </w:pPr>
+            <w:r>
+              <w:rPr>
+                <w:rFonts w:ascii="Times New Roman" w:hAnsi="Times New Roman" w:cs="Times New Roman"/>
+                <w:bCs/>
+                <w:sz w:val="24"/>
+                <w:szCs w:val="24"/>
+              </w:rPr>
+              <w:t xml:space="preserve">${kak.cover.subKegiatan}</w:t>
+            </w:r>
+          </w:p>
+        </w:tc>
+      </w:tr>
+      <w:tr>
+        <w:trPr>
+          <w:trHeight w:val="829"/>
+        </w:trPr>
+        <w:tc>
+          <w:tcPr>
+            <w:tcW w:w="2445" w:type="dxa"/>
+            <w:tcMar>
+              <w:top w:w="100" w:type="dxa"/>
+              <w:left w:w="100" w:type="dxa"/>
+              <w:bottom w:w="100" w:type="dxa"/>
+              <w:right w:w="100" w:type="dxa"/>
+            </w:tcMar>
+          </w:tcPr>
+          <w:p>
+            <w:pPr>
+              <w:pStyle w:val="KakCoverNoSpacing"/>
+              <w:rPr>
+                <w:rFonts w:ascii="Times New Roman" w:hAnsi="Times New Roman" w:cs="Times New Roman"/>
+                <w:sz w:val="24"/>
+                <w:szCs w:val="24"/>
+              </w:rPr>
+            </w:pPr>
+            <w:r>
+              <w:rPr>
+                <w:rFonts w:ascii="Times New Roman" w:hAnsi="Times New Roman" w:cs="Times New Roman"/>
+                <w:sz w:val="24"/>
+                <w:szCs w:val="24"/>
+              </w:rPr>
+              <w:t>NILAI DPA</w:t>
+            </w:r>
+          </w:p>
+        </w:tc>
+        <w:tc>
+          <w:tcPr>
+            <w:tcW w:w="240" w:type="dxa"/>
+            <w:tcMar>
+              <w:top w:w="100" w:type="dxa"/>
+              <w:left w:w="100" w:type="dxa"/>
+              <w:bottom w:w="100" w:type="dxa"/>
+              <w:right w:w="100" w:type="dxa"/>
+            </w:tcMar>
+          </w:tcPr>
+          <w:p>
+            <w:pPr>
+              <w:pStyle w:val="KakCoverNoSpacing"/>
+              <w:rPr>
+                <w:rFonts w:ascii="Times New Roman" w:hAnsi="Times New Roman" w:cs="Times New Roman"/>
+                <w:sz w:val="24"/>
+                <w:szCs w:val="24"/>
+              </w:rPr>
+            </w:pPr>
+            <w:r>
+              <w:rPr>
+                <w:rFonts w:ascii="Times New Roman" w:hAnsi="Times New Roman" w:cs="Times New Roman"/>
+                <w:sz w:val="24"/>
+                <w:szCs w:val="24"/>
+              </w:rPr>
+              <w:t>:</w:t>
+            </w:r>
+          </w:p>
+        </w:tc>
+        <w:tc>
+          <w:tcPr>
+            <w:tcW w:w="6270" w:type="dxa"/>
+            <w:tcMar>
+              <w:top w:w="100" w:type="dxa"/>
+              <w:left w:w="100" w:type="dxa"/>
+              <w:bottom w:w="100" w:type="dxa"/>
+              <w:right w:w="100" w:type="dxa"/>
+            </w:tcMar>
+          </w:tcPr>
+          <w:p>
+            <w:pPr>
+              <w:pStyle w:val="KakCoverNoSpacing"/>
+              <w:jc w:val="both"/>
+              <w:rPr>
+                <w:rFonts w:ascii="Times New Roman" w:hAnsi="Times New Roman" w:cs="Times New Roman"/>
+                <w:bCs/>
+                <w:sz w:val="24"/>
+                <w:szCs w:val="24"/>
+              </w:rPr>
+            </w:pPr>
+            <w:r>
+              <w:rPr>
+                <w:rFonts w:ascii="Times New Roman" w:hAnsi="Times New Roman" w:cs="Times New Roman"/>
+                <w:bCs/>
+                <w:sz w:val="24"/>
+                <w:szCs w:val="24"/>
+              </w:rPr>
+              <w:t xml:space="preserve">${kak.cover.paguAnggaran}</w:t>
+            </w:r>
+          </w:p>
+        </w:tc>
+      </w:tr>
+      <w:tr>
+        <w:tc>
+          <w:tcPr>
+            <w:tcW w:w="2445" w:type="dxa"/>
+            <w:tcMar>
+              <w:top w:w="100" w:type="dxa"/>
+              <w:left w:w="100" w:type="dxa"/>
+              <w:bottom w:w="100" w:type="dxa"/>
+              <w:right w:w="100" w:type="dxa"/>
+            </w:tcMar>
+          </w:tcPr>
+          <w:p>
+            <w:pPr>
+              <w:pStyle w:val="KakCoverNoSpacing"/>
+              <w:rPr>
+                <w:rFonts w:ascii="Times New Roman" w:hAnsi="Times New Roman" w:cs="Times New Roman"/>
+                <w:sz w:val="24"/>
+                <w:szCs w:val="24"/>
+              </w:rPr>
+            </w:pPr>
+            <w:r>
+              <w:rPr>
+                <w:rFonts w:ascii="Times New Roman" w:hAnsi="Times New Roman" w:cs="Times New Roman"/>
+                <w:sz w:val="24"/>
+                <w:szCs w:val="24"/>
+              </w:rPr>
+              <w:t>LOKASI KEGIATAN</w:t>
+            </w:r>
+          </w:p>
+        </w:tc>
+        <w:tc>
+          <w:tcPr>
+            <w:tcW w:w="240" w:type="dxa"/>
+            <w:tcMar>
+              <w:top w:w="100" w:type="dxa"/>
+              <w:left w:w="100" w:type="dxa"/>
+              <w:bottom w:w="100" w:type="dxa"/>
+              <w:right w:w="100" w:type="dxa"/>
+            </w:tcMar>
+          </w:tcPr>
+          <w:p>
+            <w:pPr>
+              <w:pStyle w:val="KakCoverNoSpacing"/>
+              <w:rPr>
+                <w:rFonts w:ascii="Times New Roman" w:hAnsi="Times New Roman" w:cs="Times New Roman"/>
+                <w:sz w:val="24"/>
+                <w:szCs w:val="24"/>
+              </w:rPr>
+            </w:pPr>
+            <w:r>
+              <w:rPr>
+                <w:rFonts w:ascii="Times New Roman" w:hAnsi="Times New Roman" w:cs="Times New Roman"/>
+                <w:sz w:val="24"/>
+                <w:szCs w:val="24"/>
+              </w:rPr>
+              <w:t>:</w:t>
+            </w:r>
+          </w:p>
+        </w:tc>
+        <w:tc>
+          <w:tcPr>
+            <w:tcW w:w="6270" w:type="dxa"/>
+            <w:tcMar>
+              <w:top w:w="100" w:type="dxa"/>
+              <w:left w:w="100" w:type="dxa"/>
+              <w:bottom w:w="100" w:type="dxa"/>
+              <w:right w:w="100" w:type="dxa"/>
+            </w:tcMar>
+          </w:tcPr>
+          <w:p>
+            <w:pPr>
+              <w:pStyle w:val="KakCoverNoSpacing"/>
+              <w:jc w:val="both"/>
+              <w:rPr>
+                <w:rFonts w:ascii="Times New Roman" w:hAnsi="Times New Roman" w:cs="Times New Roman"/>
+                <w:sz w:val="24"/>
+                <w:szCs w:val="24"/>
+              </w:rPr>
+            </w:pPr>
+            <w:r>
+              <w:rPr>
+                <w:rFonts w:ascii="Times New Roman" w:hAnsi="Times New Roman" w:cs="Times New Roman"/>
+                <w:sz w:val="24"/>
+                <w:szCs w:val="24"/>
+              </w:rPr>
+              <w:t xml:space="preserve">${kak.cover.lokasi}</w:t>
+            </w:r>
+          </w:p>
+        </w:tc>
+      </w:tr>
+    </w:tbl>
+    <w:p xmlns:w="http://schemas.openxmlformats.org/wordprocessingml/2006/main" xmlns:w14="http://schemas.microsoft.com/office/word/2010/wordml" xmlns:wpc="http://schemas.microsoft.com/office/word/2010/wordprocessingCanvas" xmlns:cx="http://schemas.microsoft.com/office/drawing/2014/chartex" xmlns:cx1="http://schemas.microsoft.com/office/drawing/2015/9/8/chartex" xmlns:cx2="http://schemas.microsoft.com/office/drawing/2015/10/21/chartex" xmlns:cx3="http://schemas.microsoft.com/office/drawing/2016/5/9/chartex" xmlns:cx4="http://schemas.microsoft.com/office/drawing/2016/5/10/chartex" xmlns:cx5="http://schemas.microsoft.com/office/drawing/2016/5/11/chartex" xmlns:cx6="http://schemas.microsoft.com/office/drawing/2016/5/12/chartex" xmlns:cx7="http://schemas.microsoft.com/office/drawing/2016/5/13/chartex" xmlns:cx8="http://schemas.microsoft.com/office/drawing/2016/5/14/chartex" xmlns:mc="http://schemas.openxmlformats.org/markup-compatibility/2006" xmlns:aink="http://schemas.microsoft.com/office/drawing/2016/ink" xmlns:am3d="http://schemas.microsoft.com/office/drawing/2017/model3d" xmlns:o="urn:schemas-microsoft-com:office:office" xmlns:oel="http://schemas.microsoft.com/office/2019/extlst" xmlns:r="http://schemas.openxmlformats.org/officeDocument/2006/relationships" xmlns:m="http://schemas.openxmlformats.org/officeDocument/2006/math" xmlns:v="urn:schemas-microsoft-com:vml" xmlns:wp14="http://schemas.microsoft.com/office/word/2010/wordprocessingDrawing" xmlns:wp="http://schemas.openxmlformats.org/drawingml/2006/wordprocessingDrawing" xmlns:w10="urn:schemas-microsoft-com:office:word" xmlns:w15="http://schemas.microsoft.com/office/word/2012/wordml" xmlns:w16cex="http://schemas.microsoft.com/office/word/2018/wordml/cex" xmlns:w16cid="http://schemas.microsoft.com/office/word/2016/wordml/cid" xmlns:w16="http://schemas.microsoft.com/office/word/2018/wordml" xmlns:w16du="http://schemas.microsoft.com/office/word/2023/wordml/word16du" xmlns:w16sdtdh="http://schemas.microsoft.com/office/word/2020/wordml/sdtdatahash" xmlns:w16sdtfl="http://schemas.microsoft.com/office/word/2024/wordml/sdtformatlock" xmlns:w16se="http://schemas.microsoft.com/office/word/2015/wordml/symex" xmlns:wpg="http://schemas.microsoft.com/office/word/2010/wordprocessingGroup" xmlns:wpi="http://schemas.microsoft.com/office/word/2010/wordprocessingInk" xmlns:wne="http://schemas.microsoft.com/office/word/2006/wordml" xmlns:wps="http://schemas.microsoft.com/office/word/2010/wordprocessingShape">
+      <w:pPr>
+        <w:pStyle w:val="KakCoverNormal"/>
+        <w:rPr>
+          <w:b/>
+          <w:sz w:val="36"/>
+          <w:szCs w:val="36"/>
+        </w:rPr>
+      </w:pPr>
+    </w:p>
+    <w:p xmlns:w="http://schemas.openxmlformats.org/wordprocessingml/2006/main" xmlns:w14="http://schemas.microsoft.com/office/word/2010/wordml" xmlns:wpc="http://schemas.microsoft.com/office/word/2010/wordprocessingCanvas" xmlns:cx="http://schemas.microsoft.com/office/drawing/2014/chartex" xmlns:cx1="http://schemas.microsoft.com/office/drawing/2015/9/8/chartex" xmlns:cx2="http://schemas.microsoft.com/office/drawing/2015/10/21/chartex" xmlns:cx3="http://schemas.microsoft.com/office/drawing/2016/5/9/chartex" xmlns:cx4="http://schemas.microsoft.com/office/drawing/2016/5/10/chartex" xmlns:cx5="http://schemas.microsoft.com/office/drawing/2016/5/11/chartex" xmlns:cx6="http://schemas.microsoft.com/office/drawing/2016/5/12/chartex" xmlns:cx7="http://schemas.microsoft.com/office/drawing/2016/5/13/chartex" xmlns:cx8="http://schemas.microsoft.com/office/drawing/2016/5/14/chartex" xmlns:mc="http://schemas.openxmlformats.org/markup-compatibility/2006" xmlns:aink="http://schemas.microsoft.com/office/drawing/2016/ink" xmlns:am3d="http://schemas.microsoft.com/office/drawing/2017/model3d" xmlns:o="urn:schemas-microsoft-com:office:office" xmlns:oel="http://schemas.microsoft.com/office/2019/extlst" xmlns:r="http://schemas.openxmlformats.org/officeDocument/2006/relationships" xmlns:m="http://schemas.openxmlformats.org/officeDocument/2006/math" xmlns:v="urn:schemas-microsoft-com:vml" xmlns:wp14="http://schemas.microsoft.com/office/word/2010/wordprocessingDrawing" xmlns:wp="http://schemas.openxmlformats.org/drawingml/2006/wordprocessingDrawing" xmlns:w10="urn:schemas-microsoft-com:office:word" xmlns:w15="http://schemas.microsoft.com/office/word/2012/wordml" xmlns:w16cex="http://schemas.microsoft.com/office/word/2018/wordml/cex" xmlns:w16cid="http://schemas.microsoft.com/office/word/2016/wordml/cid" xmlns:w16="http://schemas.microsoft.com/office/word/2018/wordml" xmlns:w16du="http://schemas.microsoft.com/office/word/2023/wordml/word16du" xmlns:w16sdtdh="http://schemas.microsoft.com/office/word/2020/wordml/sdtdatahash" xmlns:w16sdtfl="http://schemas.microsoft.com/office/word/2024/wordml/sdtformatlock" xmlns:w16se="http://schemas.microsoft.com/office/word/2015/wordml/symex" xmlns:wpg="http://schemas.microsoft.com/office/word/2010/wordprocessingGroup" xmlns:wpi="http://schemas.microsoft.com/office/word/2010/wordprocessingInk" xmlns:wne="http://schemas.microsoft.com/office/word/2006/wordml" xmlns:wps="http://schemas.microsoft.com/office/word/2010/wordprocessingShape">
+      <w:pPr>
+        <w:pStyle w:val="KakCoverNormal"/>
+        <w:rPr>
+          <w:b/>
+          <w:sz w:val="36"/>
+          <w:szCs w:val="36"/>
+        </w:rPr>
+      </w:pPr>
+    </w:p>
+    <w:p xmlns:w="http://schemas.openxmlformats.org/wordprocessingml/2006/main" xmlns:w14="http://schemas.microsoft.com/office/word/2010/wordml" xmlns:wpc="http://schemas.microsoft.com/office/word/2010/wordprocessingCanvas" xmlns:cx="http://schemas.microsoft.com/office/drawing/2014/chartex" xmlns:cx1="http://schemas.microsoft.com/office/drawing/2015/9/8/chartex" xmlns:cx2="http://schemas.microsoft.com/office/drawing/2015/10/21/chartex" xmlns:cx3="http://schemas.microsoft.com/office/drawing/2016/5/9/chartex" xmlns:cx4="http://schemas.microsoft.com/office/drawing/2016/5/10/chartex" xmlns:cx5="http://schemas.microsoft.com/office/drawing/2016/5/11/chartex" xmlns:cx6="http://schemas.microsoft.com/office/drawing/2016/5/12/chartex" xmlns:cx7="http://schemas.microsoft.com/office/drawing/2016/5/13/chartex" xmlns:cx8="http://schemas.microsoft.com/office/drawing/2016/5/14/chartex" xmlns:mc="http://schemas.openxmlformats.org/markup-compatibility/2006" xmlns:aink="http://schemas.microsoft.com/office/drawing/2016/ink" xmlns:am3d="http://schemas.microsoft.com/office/drawing/2017/model3d" xmlns:o="urn:schemas-microsoft-com:office:office" xmlns:oel="http://schemas.microsoft.com/office/2019/extlst" xmlns:r="http://schemas.openxmlformats.org/officeDocument/2006/relationships" xmlns:m="http://schemas.openxmlformats.org/officeDocument/2006/math" xmlns:v="urn:schemas-microsoft-com:vml" xmlns:wp14="http://schemas.microsoft.com/office/word/2010/wordprocessingDrawing" xmlns:wp="http://schemas.openxmlformats.org/drawingml/2006/wordprocessingDrawing" xmlns:w10="urn:schemas-microsoft-com:office:word" xmlns:w15="http://schemas.microsoft.com/office/word/2012/wordml" xmlns:w16cex="http://schemas.microsoft.com/office/word/2018/wordml/cex" xmlns:w16cid="http://schemas.microsoft.com/office/word/2016/wordml/cid" xmlns:w16="http://schemas.microsoft.com/office/word/2018/wordml" xmlns:w16du="http://schemas.microsoft.com/office/word/2023/wordml/word16du" xmlns:w16sdtdh="http://schemas.microsoft.com/office/word/2020/wordml/sdtdatahash" xmlns:w16sdtfl="http://schemas.microsoft.com/office/word/2024/wordml/sdtformatlock" xmlns:w16se="http://schemas.microsoft.com/office/word/2015/wordml/symex" xmlns:wpg="http://schemas.microsoft.com/office/word/2010/wordprocessingGroup" xmlns:wpi="http://schemas.microsoft.com/office/word/2010/wordprocessingInk" xmlns:wne="http://schemas.microsoft.com/office/word/2006/wordml" xmlns:wps="http://schemas.microsoft.com/office/word/2010/wordprocessingShape">
+      <w:pPr>
+        <w:pStyle w:val="KakCoverNormal"/>
+        <w:spacing w:after="200"/>
+        <w:jc w:val="center"/>
+        <w:rPr>
+          <w:b/>
+          <w:sz w:val="28"/>
+          <w:szCs w:val="28"/>
+        </w:rPr>
+      </w:pPr>
+      <w:r>
+        <w:rPr>
+          <w:b/>
+          <w:sz w:val="28"/>
+          <w:szCs w:val="28"/>
+        </w:rPr>
+        <w:t xml:space="preserve">${kak.cover.year}</w:t>
+      </w:r>
+    </w:p>
+    <w:p xmlns:w="http://schemas.openxmlformats.org/wordprocessingml/2006/main" xmlns:w14="http://schemas.microsoft.com/office/word/2010/wordml" xmlns:wpc="http://schemas.microsoft.com/office/word/2010/wordprocessingCanvas" xmlns:cx="http://schemas.microsoft.com/office/drawing/2014/chartex" xmlns:cx1="http://schemas.microsoft.com/office/drawing/2015/9/8/chartex" xmlns:cx2="http://schemas.microsoft.com/office/drawing/2015/10/21/chartex" xmlns:cx3="http://schemas.microsoft.com/office/drawing/2016/5/9/chartex" xmlns:cx4="http://schemas.microsoft.com/office/drawing/2016/5/10/chartex" xmlns:cx5="http://schemas.microsoft.com/office/drawing/2016/5/11/chartex" xmlns:cx6="http://schemas.microsoft.com/office/drawing/2016/5/12/chartex" xmlns:cx7="http://schemas.microsoft.com/office/drawing/2016/5/13/chartex" xmlns:cx8="http://schemas.microsoft.com/office/drawing/2016/5/14/chartex" xmlns:mc="http://schemas.openxmlformats.org/markup-compatibility/2006" xmlns:aink="http://schemas.microsoft.com/office/drawing/2016/ink" xmlns:am3d="http://schemas.microsoft.com/office/drawing/2017/model3d" xmlns:o="urn:schemas-microsoft-com:office:office" xmlns:oel="http://schemas.microsoft.com/office/2019/extlst" xmlns:r="http://schemas.openxmlformats.org/officeDocument/2006/relationships" xmlns:m="http://schemas.openxmlformats.org/officeDocument/2006/math" xmlns:v="urn:schemas-microsoft-com:vml" xmlns:wp14="http://schemas.microsoft.com/office/word/2010/wordprocessingDrawing" xmlns:wp="http://schemas.openxmlformats.org/drawingml/2006/wordprocessingDrawing" xmlns:w10="urn:schemas-microsoft-com:office:word" xmlns:w15="http://schemas.microsoft.com/office/word/2012/wordml" xmlns:w16cex="http://schemas.microsoft.com/office/word/2018/wordml/cex" xmlns:w16cid="http://schemas.microsoft.com/office/word/2016/wordml/cid" xmlns:w16="http://schemas.microsoft.com/office/word/2018/wordml" xmlns:w16du="http://schemas.microsoft.com/office/word/2023/wordml/word16du" xmlns:w16sdtdh="http://schemas.microsoft.com/office/word/2020/wordml/sdtdatahash" xmlns:w16sdtfl="http://schemas.microsoft.com/office/word/2024/wordml/sdtformatlock" xmlns:w16se="http://schemas.microsoft.com/office/word/2015/wordml/symex" xmlns:wpg="http://schemas.microsoft.com/office/word/2010/wordprocessingGroup" xmlns:wpi="http://schemas.microsoft.com/office/word/2010/wordprocessingInk" xmlns:wne="http://schemas.microsoft.com/office/word/2006/wordml" xmlns:wps="http://schemas.microsoft.com/office/word/2010/wordprocessingShape">
+      <w:pPr>
+        <w:pStyle w:val="KakCoverNormal"/>
+        <w:spacing w:after="160" w:line="259" w:lineRule="auto"/>
+        <w:sectPr>
+          <w:headerReference w:type="default" r:id="rIdKakCoverHeader"/>
+          <w:type w:val="nextPage"/>
+          <w:pgSz w:w="12240" w:h="15840"/>
+          <w:pgMar w:top="1440" w:right="1440" w:bottom="1440" w:left="1440" w:header="720" w:footer="720" w:gutter="0"/>
+          <w:pgNumType w:start="1"/>
+          <w:cols w:space="720"/>
+          <w:docGrid w:linePitch="360"/>
+        </w:sectPr>
+      </w:pPr>
+    </w:p>
     <w:p>
       <w:pPr>
         <w:jc w:val="center"/>
@@ -1405,6 +2195,7 @@
           <w:sz w:val="24"/>
         </w:rPr>
         <w:sectPr>
+          <w:headerReference w:type="default" r:id="rIdKakBodyHeader"/>
           <w:footerReference w:type="default" r:id="rId7"/>
           <w:type w:val="continuous"/>
           <w:pgSz w:w="11910" w:h="16840"/>
@@ -5451,6 +6242,30 @@
     </w:p>
   </w:footnote>
 </w:footnotes>
+</file>
+
+<file path=word/header-kak-body.xml><?xml version="1.0" encoding="utf-8"?>
+<w:hdr xmlns:w="http://schemas.openxmlformats.org/wordprocessingml/2006/main">
+  <w:p/>
+</w:hdr>
+</file>
+
+<file path=word/header-kak-cover.xml><?xml version="1.0" encoding="utf-8"?>
+<w:hdr xmlns:wpc="http://schemas.microsoft.com/office/word/2010/wordprocessingCanvas" xmlns:cx="http://schemas.microsoft.com/office/drawing/2014/chartex" xmlns:cx1="http://schemas.microsoft.com/office/drawing/2015/9/8/chartex" xmlns:cx2="http://schemas.microsoft.com/office/drawing/2015/10/21/chartex" xmlns:cx3="http://schemas.microsoft.com/office/drawing/2016/5/9/chartex" xmlns:cx4="http://schemas.microsoft.com/office/drawing/2016/5/10/chartex" xmlns:cx5="http://schemas.microsoft.com/office/drawing/2016/5/11/chartex" xmlns:cx6="http://schemas.microsoft.com/office/drawing/2016/5/12/chartex" xmlns:cx7="http://schemas.microsoft.com/office/drawing/2016/5/13/chartex" xmlns:cx8="http://schemas.microsoft.com/office/drawing/2016/5/14/chartex" xmlns:mc="http://schemas.openxmlformats.org/markup-compatibility/2006" xmlns:aink="http://schemas.microsoft.com/office/drawing/2016/ink" xmlns:am3d="http://schemas.microsoft.com/office/drawing/2017/model3d" xmlns:o="urn:schemas-microsoft-com:office:office" xmlns:oel="http://schemas.microsoft.com/office/2019/extlst" xmlns:r="http://schemas.openxmlformats.org/officeDocument/2006/relationships" xmlns:m="http://schemas.openxmlformats.org/officeDocument/2006/math" xmlns:v="urn:schemas-microsoft-com:vml" xmlns:wp14="http://schemas.microsoft.com/office/word/2010/wordprocessingDrawing" xmlns:wp="http://schemas.openxmlformats.org/drawingml/2006/wordprocessingDrawing" xmlns:w10="urn:schemas-microsoft-com:office:word" xmlns:w="http://schemas.openxmlformats.org/wordprocessingml/2006/main" xmlns:w14="http://schemas.microsoft.com/office/word/2010/wordml" xmlns:w15="http://schemas.microsoft.com/office/word/2012/wordml" xmlns:w16cex="http://schemas.microsoft.com/office/word/2018/wordml/cex" xmlns:w16cid="http://schemas.microsoft.com/office/word/2016/wordml/cid" xmlns:w16="http://schemas.microsoft.com/office/word/2018/wordml" xmlns:w16du="http://schemas.microsoft.com/office/word/2023/wordml/word16du" xmlns:w16sdtdh="http://schemas.microsoft.com/office/word/2020/wordml/sdtdatahash" xmlns:w16sdtfl="http://schemas.microsoft.com/office/word/2024/wordml/sdtformatlock" xmlns:w16se="http://schemas.microsoft.com/office/word/2015/wordml/symex" xmlns:wpg="http://schemas.microsoft.com/office/word/2010/wordprocessingGroup" xmlns:wpi="http://schemas.microsoft.com/office/word/2010/wordprocessingInk" xmlns:wne="http://schemas.microsoft.com/office/word/2006/wordml" xmlns:wps="http://schemas.microsoft.com/office/word/2010/wordprocessingShape" mc:Ignorable="w14 w15 w16se w16cid w16 w16cex w16sdtdh w16sdtfl w16du wp14">
+  <w:p>
+    <w:pPr>
+      <w:pStyle w:val="KakCoverHeader"/>
+      <w:jc w:val="right"/>
+    </w:pPr>
+    <w:r>
+      <w:rPr>
+        <w:rFonts w:ascii="Times New Roman" w:hAnsi="Times New Roman"/>
+        <w:sz w:val="20"/>
+      </w:rPr>
+      <w:t xml:space="preserve">${kak.cover.sequence}</w:t>
+    </w:r>
+  </w:p>
+</w:hdr>
 </file>
 
 <file path=word/numbering.xml><?xml version="1.0" encoding="utf-8"?>
@@ -7279,6 +8094,78 @@
       <w:lang w:val="id"/>
     </w:rPr>
   </w:style>
+  <w:style xmlns:w="http://schemas.openxmlformats.org/wordprocessingml/2006/main" w:type="character" w:styleId="KakCoverDefaultParagraphFont">
+    <w:name w:val="KAK Cover DefaultParagraphFont"/>
+    <w:uiPriority w:val="1"/>
+    <w:semiHidden/>
+    <w:unhideWhenUsed/>
+  </w:style>
+  <w:style xmlns:w="http://schemas.openxmlformats.org/wordprocessingml/2006/main" w:type="paragraph" w:styleId="KakCoverHeader">
+    <w:name w:val="KAK Cover Header"/>
+    <w:basedOn w:val="KakCoverNormal"/>
+    <w:link w:val="KakCoverHeaderChar"/>
+    <w:uiPriority w:val="99"/>
+    <w:unhideWhenUsed/>
+    <w:rsid w:val="00E763C5"/>
+    <w:pPr>
+      <w:tabs>
+        <w:tab w:val="center" w:pos="4513"/>
+        <w:tab w:val="right" w:pos="9026"/>
+      </w:tabs>
+    </w:pPr>
+  </w:style>
+  <w:style xmlns:w="http://schemas.openxmlformats.org/wordprocessingml/2006/main" w:type="character" w:customStyle="1" w:styleId="KakCoverHeaderChar">
+    <w:name w:val="KAK Cover HeaderChar"/>
+    <w:basedOn w:val="KakCoverDefaultParagraphFont"/>
+    <w:link w:val="KakCoverHeader"/>
+    <w:uiPriority w:val="99"/>
+    <w:rsid w:val="00E763C5"/>
+    <w:rPr>
+      <w:rFonts w:ascii="Times New Roman" w:eastAsia="Times New Roman" w:hAnsi="Times New Roman" w:cs="Times New Roman"/>
+      <w:sz w:val="20"/>
+      <w:szCs w:val="20"/>
+    </w:rPr>
+  </w:style>
+  <w:style xmlns:w="http://schemas.openxmlformats.org/wordprocessingml/2006/main" w:type="paragraph" w:styleId="KakCoverNoSpacing">
+    <w:name w:val="KAK Cover NoSpacing"/>
+    <w:uiPriority w:val="1"/>
+    <w:qFormat/>
+    <w:rsid w:val="00424237"/>
+    <w:pPr>
+      <w:spacing w:after="0" w:line="240" w:lineRule="auto"/>
+    </w:pPr>
+    <w:rPr>
+      <w:rFonts w:ascii="Arial" w:eastAsia="Arial" w:hAnsi="Arial" w:cs="Arial"/>
+    </w:rPr>
+  </w:style>
+  <w:style xmlns:w="http://schemas.openxmlformats.org/wordprocessingml/2006/main" w:type="paragraph" w:styleId="KakCoverNormal">
+    <w:name w:val="KAK Cover Normal"/>
+    <w:qFormat/>
+    <w:rsid w:val="00424237"/>
+    <w:pPr>
+      <w:spacing w:after="0" w:line="240" w:lineRule="auto"/>
+    </w:pPr>
+    <w:rPr>
+      <w:rFonts w:ascii="Times New Roman" w:eastAsia="Times New Roman" w:hAnsi="Times New Roman" w:cs="Times New Roman"/>
+      <w:sz w:val="20"/>
+      <w:szCs w:val="20"/>
+    </w:rPr>
+  </w:style>
+  <w:style xmlns:w="http://schemas.openxmlformats.org/wordprocessingml/2006/main" w:type="table" w:styleId="KakCoverTableNormal">
+    <w:name w:val="KAK Cover TableNormal"/>
+    <w:uiPriority w:val="99"/>
+    <w:semiHidden/>
+    <w:unhideWhenUsed/>
+    <w:tblPr>
+      <w:tblInd w:w="0" w:type="dxa"/>
+      <w:tblCellMar>
+        <w:top w:w="0" w:type="dxa"/>
+        <w:left w:w="108" w:type="dxa"/>
+        <w:bottom w:w="0" w:type="dxa"/>
+        <w:right w:w="108" w:type="dxa"/>
+      </w:tblCellMar>
+    </w:tblPr>
+  </w:style>
 </w:styles>
 </file>
 

</xml_diff>